<commit_message>
docs: remove log correlation module, add role-attendance guide
Module 8 (Log Correlation & RCA) required a Splunk Platform instance
that workshop participants don't have access to, so it's removed and
Wrap-Up is renumbered to Module 8. Adds ROLES.md mapping each module
to the roles that should attend, for the KPMG observability owner to
scope invites. Regenerates the combined docx guide accordingly.
</commit_message>
<xml_diff>
--- a/workshop/AI_Agent_Observability_Workshop_Guide.docx
+++ b/workshop/AI_Agent_Observability_Workshop_Guide.docx
@@ -100,6 +100,27 @@
       </w:r>
       <w:r>
         <w:t xml:space="preserve"> — full module breakdown with time estimates and what each module proves.</w:t>
+      </w:r>
+    </w:p>
+    <w:p>
+      <w:r>
+        <w:rPr>
+          <w:b/>
+        </w:rPr>
+        <w:t>Planning attendance?</w:t>
+      </w:r>
+      <w:r>
+        <w:t xml:space="preserve"> See </w:t>
+      </w:r>
+      <w:r>
+        <w:rPr>
+          <w:i/>
+          <w:color w:val="2E5B8A"/>
+        </w:rPr>
+        <w:t>ROLES.md</w:t>
+      </w:r>
+      <w:r>
+        <w:t xml:space="preserve"> — which roles should attend which modules, and suggested attendance patterns if you can't get everyone in the room for the full session.</w:t>
       </w:r>
     </w:p>
     <w:p>
@@ -552,7 +573,7 @@
           <w:p>
             <w:r/>
             <w:r>
-              <w:t>8. Log Correlation &amp; RCA</w:t>
+              <w:t>8. Wrap-Up &amp; Next Steps</w:t>
             </w:r>
           </w:p>
         </w:tc>
@@ -567,35 +588,7 @@
                 <w:i/>
                 <w:color w:val="2E5B8A"/>
               </w:rPr>
-              <w:t>08-log-correlation-rca.md</w:t>
-            </w:r>
-          </w:p>
-        </w:tc>
-      </w:tr>
-      <w:tr>
-        <w:tc>
-          <w:tcPr>
-            <w:tcW w:type="dxa" w:w="4320"/>
-          </w:tcPr>
-          <w:p>
-            <w:r/>
-            <w:r>
-              <w:t>9. Wrap-Up &amp; Next Steps</w:t>
-            </w:r>
-          </w:p>
-        </w:tc>
-        <w:tc>
-          <w:tcPr>
-            <w:tcW w:type="dxa" w:w="4320"/>
-          </w:tcPr>
-          <w:p>
-            <w:r/>
-            <w:r>
-              <w:rPr>
-                <w:i/>
-                <w:color w:val="2E5B8A"/>
-              </w:rPr>
-              <w:t>09-wrap-up.md</w:t>
+              <w:t>08-wrap-up.md</w:t>
             </w:r>
           </w:p>
         </w:tc>
@@ -639,31 +632,62 @@
         <w:pStyle w:val="Heading2"/>
       </w:pPr>
       <w:r>
-        <w:t>Known limitation: Log Observer Connect</w:t>
+        <w:t>Known limitation: log correlation / Splunk Platform</w:t>
       </w:r>
     </w:p>
     <w:p>
       <w:r>
-        <w:t xml:space="preserve">If you're running this on a shared workshop Splunk Cloud instance, you likely don't have Splunk Platform admin access, so the APM → Logs "Related Content" button (Log Observer Connect) can't be self-configured. </w:t>
+        <w:t xml:space="preserve">This workshop's shared environment doesn't include a Splunk Platform (Splunk Cloud) instance for participants to search logs in directly, so the standalone log-search / RCA exercise isn't part of this run. The underlying pattern — structured logs auto-tagged with </w:t>
       </w:r>
       <w:r>
         <w:rPr>
-          <w:b/>
+          <w:rFonts w:ascii="Consolas" w:hAnsi="Consolas"/>
+          <w:sz w:val="20"/>
         </w:rPr>
-        <w:t>This does not block Module 8</w:t>
-      </w:r>
-      <w:r>
-        <w:t xml:space="preserve"> — logs are fully searchable directly in Splunk Platform with no additional setup. See </w:t>
+        <w:t>trace_id</w:t>
+      </w:r>
+      <w:r>
+        <w:t>/</w:t>
+      </w:r>
+      <w:r>
+        <w:rPr>
+          <w:rFonts w:ascii="Consolas" w:hAnsi="Consolas"/>
+          <w:sz w:val="20"/>
+        </w:rPr>
+        <w:t>span_id</w:t>
+      </w:r>
+      <w:r>
+        <w:t xml:space="preserve">, full exception stack traces via </w:t>
+      </w:r>
+      <w:r>
+        <w:rPr>
+          <w:rFonts w:ascii="Consolas" w:hAnsi="Consolas"/>
+          <w:sz w:val="20"/>
+        </w:rPr>
+        <w:t>logger.exception()</w:t>
+      </w:r>
+      <w:r>
+        <w:t xml:space="preserve"> — is still visible in code and in </w:t>
+      </w:r>
+      <w:r>
+        <w:rPr>
+          <w:rFonts w:ascii="Consolas" w:hAnsi="Consolas"/>
+          <w:sz w:val="20"/>
+        </w:rPr>
+        <w:t>kubectl logs</w:t>
+      </w:r>
+      <w:r>
+        <w:t xml:space="preserve"> output during Module 2 and every failure scenario. Log Observer Connect (the APM → Logs "Related Content" button) also requires Splunk Platform admin access and is out of scope for the same reason. See the note in </w:t>
       </w:r>
       <w:r>
         <w:rPr>
           <w:i/>
           <w:color w:val="2E5B8A"/>
         </w:rPr>
-        <w:t>08-log-correlation-rca.md</w:t>
-      </w:r>
-      <w:r>
-        <w:t xml:space="preserve"> for details.</w:t>
+        <w:t>08-wrap-up.md</w:t>
+      </w:r>
+      <w:r>
+        <w:t>.</w:t>
       </w:r>
     </w:p>
     <w:p>
@@ -709,7 +733,7 @@
         <w:t>Total time:</w:t>
       </w:r>
       <w:r>
-        <w:t xml:space="preserve"> ~2h45m (can be split across two sessions, or trimmed — see "If you only have 90 minutes" below)</w:t>
+        <w:t xml:space="preserve"> ~2h30m (can be split across two sessions, or trimmed — see "If you only have 90 minutes" below)</w:t>
       </w:r>
     </w:p>
     <w:p>
@@ -1341,67 +1365,6 @@
                 <w:i/>
                 <w:color w:val="2E5B8A"/>
               </w:rPr>
-              <w:t>Log Correlation &amp; RCA</w:t>
-            </w:r>
-          </w:p>
-        </w:tc>
-        <w:tc>
-          <w:tcPr>
-            <w:tcW w:type="dxa" w:w="1728"/>
-          </w:tcPr>
-          <w:p>
-            <w:r/>
-            <w:r>
-              <w:t>15 min</w:t>
-            </w:r>
-          </w:p>
-        </w:tc>
-        <w:tc>
-          <w:tcPr>
-            <w:tcW w:type="dxa" w:w="1728"/>
-          </w:tcPr>
-          <w:p>
-            <w:r/>
-            <w:r>
-              <w:t>Pull the exact exception tied to a trace_id</w:t>
-            </w:r>
-          </w:p>
-        </w:tc>
-        <w:tc>
-          <w:tcPr>
-            <w:tcW w:type="dxa" w:w="1728"/>
-          </w:tcPr>
-          <w:p>
-            <w:r/>
-            <w:r>
-              <w:t>Audit trail — evidence of what the AI system did, when, why</w:t>
-            </w:r>
-          </w:p>
-        </w:tc>
-      </w:tr>
-      <w:tr>
-        <w:tc>
-          <w:tcPr>
-            <w:tcW w:type="dxa" w:w="1728"/>
-          </w:tcPr>
-          <w:p>
-            <w:r/>
-            <w:r>
-              <w:t>9</w:t>
-            </w:r>
-          </w:p>
-        </w:tc>
-        <w:tc>
-          <w:tcPr>
-            <w:tcW w:type="dxa" w:w="1728"/>
-          </w:tcPr>
-          <w:p>
-            <w:r/>
-            <w:r>
-              <w:rPr>
-                <w:i/>
-                <w:color w:val="2E5B8A"/>
-              </w:rPr>
               <w:t>Wrap-Up &amp; Next Steps</w:t>
             </w:r>
           </w:p>
@@ -1444,6 +1407,30 @@
     <w:p/>
     <w:p>
       <w:pPr>
+        <w:pStyle w:val="IntenseQuote"/>
+      </w:pPr>
+      <w:r>
+        <w:rPr>
+          <w:b/>
+        </w:rPr>
+        <w:t>Note:</w:t>
+      </w:r>
+      <w:r>
+        <w:t xml:space="preserve"> log-trace correlation (structured logs auto-tagged with </w:t>
+      </w:r>
+      <w:r>
+        <w:rPr>
+          <w:rFonts w:ascii="Consolas" w:hAnsi="Consolas"/>
+          <w:sz w:val="20"/>
+        </w:rPr>
+        <w:t>trace_id</w:t>
+      </w:r>
+      <w:r>
+        <w:t>, full exception stack traces) is instrumented and visible in Module 2, but a standalone Splunk Platform log-search exercise isn't included in this run — the shared workshop environment doesn't include a Splunk Cloud instance for participants. See the note in Module 8.</w:t>
+      </w:r>
+    </w:p>
+    <w:p>
+      <w:pPr>
         <w:pStyle w:val="Heading2"/>
       </w:pPr>
       <w:r>
@@ -1490,7 +1477,7 @@
         <w:pStyle w:val="ListBullet"/>
       </w:pPr>
       <w:r>
-        <w:t>A working log-to-trace correlation pattern you can lift directly into your own services</w:t>
+        <w:t>A log-to-trace correlation pattern (visible in code in Module 2) you can lift directly into your own services</w:t>
       </w:r>
     </w:p>
     <w:p>
@@ -1561,24 +1548,10 @@
         <w:rPr>
           <w:b/>
         </w:rPr>
-        <w:t>Log correlation</w:t>
-      </w:r>
-      <w:r>
-        <w:t xml:space="preserve"> (Module 8) comes last among the technical modules because by then you've generated real error traces to correlate against — it's not abstract.</w:t>
-      </w:r>
-    </w:p>
-    <w:p>
-      <w:pPr>
-        <w:pStyle w:val="ListNumber"/>
-      </w:pPr>
-      <w:r>
-        <w:rPr>
-          <w:b/>
-        </w:rPr>
         <w:t>Wrap-up</w:t>
       </w:r>
       <w:r>
-        <w:t xml:space="preserve"> (Module 9) is deliberately short and discussion-driven — the goal is to turn the hands-on experience into a decision about next steps, not another lecture.</w:t>
+        <w:t xml:space="preserve"> (Module 8) is deliberately short and discussion-driven — the goal is to turn the hands-on experience into a decision about next steps, not another lecture.</w:t>
       </w:r>
     </w:p>
     <w:p>
@@ -1616,15 +1589,6 @@
           <w:b/>
         </w:rPr>
         <w:t>Module 8</w:t>
-      </w:r>
-      <w:r>
-        <w:t xml:space="preserve"> (log correlation, 15 min) → </w:t>
-      </w:r>
-      <w:r>
-        <w:rPr>
-          <w:b/>
-        </w:rPr>
-        <w:t>Module 9</w:t>
       </w:r>
       <w:r>
         <w:t xml:space="preserve"> (wrap-up, 10 min). Skip Modules 2–6 and read them afterward as reference.</w:t>
@@ -1689,7 +1653,553 @@
         <w:t>README.md</w:t>
       </w:r>
       <w:r>
-        <w:t xml:space="preserve"> for the full setup checklist before starting Module 1.</w:t>
+        <w:t xml:space="preserve"> for the full setup checklist before starting Module 1, and </w:t>
+      </w:r>
+      <w:r>
+        <w:rPr>
+          <w:i/>
+          <w:color w:val="2E5B8A"/>
+        </w:rPr>
+        <w:t>ROLES.md</w:t>
+      </w:r>
+      <w:r>
+        <w:t xml:space="preserve"> for who on your team should attend which modules.</w:t>
+      </w:r>
+    </w:p>
+    <w:p>
+      <w:r>
+        <w:br w:type="page"/>
+      </w:r>
+    </w:p>
+    <w:p>
+      <w:pPr>
+        <w:pStyle w:val="Heading1"/>
+      </w:pPr>
+      <w:r>
+        <w:t>Who Should Attend Which Modules</w:t>
+      </w:r>
+    </w:p>
+    <w:p>
+      <w:r>
+        <w:t>Use this to decide who from your organization needs to be in the room, and where they can tune in/out if the full session doesn't fit their calendar.</w:t>
+      </w:r>
+    </w:p>
+    <w:p>
+      <w:pPr>
+        <w:pStyle w:val="Heading2"/>
+      </w:pPr>
+      <w:r>
+        <w:t>Role → Module Matrix</w:t>
+      </w:r>
+    </w:p>
+    <w:tbl>
+      <w:tblPr>
+        <w:tblStyle w:val="LightGrid-Accent1"/>
+        <w:tblW w:type="auto" w:w="0"/>
+        <w:tblLook w:firstColumn="1" w:firstRow="1" w:lastColumn="0" w:lastRow="0" w:noHBand="0" w:noVBand="1" w:val="04A0"/>
+      </w:tblPr>
+      <w:tblGrid>
+        <w:gridCol w:w="2160"/>
+        <w:gridCol w:w="2160"/>
+        <w:gridCol w:w="2160"/>
+        <w:gridCol w:w="2160"/>
+      </w:tblGrid>
+      <w:tr>
+        <w:tc>
+          <w:tcPr>
+            <w:tcW w:type="dxa" w:w="2160"/>
+          </w:tcPr>
+          <w:p>
+            <w:r>
+              <w:rPr>
+                <w:b/>
+              </w:rPr>
+            </w:r>
+            <w:r>
+              <w:rPr>
+                <w:b/>
+              </w:rPr>
+              <w:t>Role</w:t>
+            </w:r>
+          </w:p>
+        </w:tc>
+        <w:tc>
+          <w:tcPr>
+            <w:tcW w:type="dxa" w:w="2160"/>
+          </w:tcPr>
+          <w:p>
+            <w:r>
+              <w:rPr>
+                <w:b/>
+              </w:rPr>
+            </w:r>
+            <w:r>
+              <w:rPr>
+                <w:b/>
+              </w:rPr>
+              <w:t>Must attend</w:t>
+            </w:r>
+          </w:p>
+        </w:tc>
+        <w:tc>
+          <w:tcPr>
+            <w:tcW w:type="dxa" w:w="2160"/>
+          </w:tcPr>
+          <w:p>
+            <w:r>
+              <w:rPr>
+                <w:b/>
+              </w:rPr>
+            </w:r>
+            <w:r>
+              <w:rPr>
+                <w:b/>
+              </w:rPr>
+              <w:t>Can skip</w:t>
+            </w:r>
+          </w:p>
+        </w:tc>
+        <w:tc>
+          <w:tcPr>
+            <w:tcW w:type="dxa" w:w="2160"/>
+          </w:tcPr>
+          <w:p>
+            <w:r>
+              <w:rPr>
+                <w:b/>
+              </w:rPr>
+            </w:r>
+            <w:r>
+              <w:rPr>
+                <w:b/>
+              </w:rPr>
+              <w:t>Why</w:t>
+            </w:r>
+          </w:p>
+        </w:tc>
+      </w:tr>
+      <w:tr>
+        <w:tc>
+          <w:tcPr>
+            <w:tcW w:type="dxa" w:w="2160"/>
+          </w:tcPr>
+          <w:p>
+            <w:r/>
+            <w:r>
+              <w:rPr>
+                <w:b/>
+              </w:rPr>
+              <w:t>Observability / Platform Owner</w:t>
+            </w:r>
+            <w:r>
+              <w:t xml:space="preserve"> (workshop sponsor)</w:t>
+            </w:r>
+          </w:p>
+        </w:tc>
+        <w:tc>
+          <w:tcPr>
+            <w:tcW w:type="dxa" w:w="2160"/>
+          </w:tcPr>
+          <w:p>
+            <w:r/>
+            <w:r>
+              <w:t>All modules</w:t>
+            </w:r>
+          </w:p>
+        </w:tc>
+        <w:tc>
+          <w:tcPr>
+            <w:tcW w:type="dxa" w:w="2160"/>
+          </w:tcPr>
+          <w:p>
+            <w:r/>
+            <w:r>
+              <w:t>None</w:t>
+            </w:r>
+          </w:p>
+        </w:tc>
+        <w:tc>
+          <w:tcPr>
+            <w:tcW w:type="dxa" w:w="2160"/>
+          </w:tcPr>
+          <w:p>
+            <w:r/>
+            <w:r>
+              <w:t>Owns the end-to-end story — needs the full picture to scope a POC and decide who else should own what afterward.</w:t>
+            </w:r>
+          </w:p>
+        </w:tc>
+      </w:tr>
+      <w:tr>
+        <w:tc>
+          <w:tcPr>
+            <w:tcW w:type="dxa" w:w="2160"/>
+          </w:tcPr>
+          <w:p>
+            <w:r/>
+            <w:r>
+              <w:rPr>
+                <w:b/>
+              </w:rPr>
+              <w:t>SRE / Platform Engineering</w:t>
+            </w:r>
+          </w:p>
+        </w:tc>
+        <w:tc>
+          <w:tcPr>
+            <w:tcW w:type="dxa" w:w="2160"/>
+          </w:tcPr>
+          <w:p>
+            <w:r/>
+            <w:r>
+              <w:t>1, 3, 4, 5, 6, 7</w:t>
+            </w:r>
+          </w:p>
+        </w:tc>
+        <w:tc>
+          <w:tcPr>
+            <w:tcW w:type="dxa" w:w="2160"/>
+          </w:tcPr>
+          <w:p>
+            <w:r/>
+            <w:r>
+              <w:t>2 (can skim)</w:t>
+            </w:r>
+          </w:p>
+        </w:tc>
+        <w:tc>
+          <w:tcPr>
+            <w:tcW w:type="dxa" w:w="2160"/>
+          </w:tcPr>
+          <w:p>
+            <w:r/>
+            <w:r>
+              <w:t>These are the people who'll actually operate this: deployment footprint (1), TE test config (3), alerting (4), and all three live triage scenarios (5–7) are their day-to-day.</w:t>
+            </w:r>
+          </w:p>
+        </w:tc>
+      </w:tr>
+      <w:tr>
+        <w:tc>
+          <w:tcPr>
+            <w:tcW w:type="dxa" w:w="2160"/>
+          </w:tcPr>
+          <w:p>
+            <w:r/>
+            <w:r>
+              <w:rPr>
+                <w:b/>
+              </w:rPr>
+              <w:t>Network Engineering / NetOps</w:t>
+            </w:r>
+          </w:p>
+        </w:tc>
+        <w:tc>
+          <w:tcPr>
+            <w:tcW w:type="dxa" w:w="2160"/>
+          </w:tcPr>
+          <w:p>
+            <w:r/>
+            <w:r>
+              <w:t>1, 3, 5, 6, 7</w:t>
+            </w:r>
+          </w:p>
+        </w:tc>
+        <w:tc>
+          <w:tcPr>
+            <w:tcW w:type="dxa" w:w="2160"/>
+          </w:tcPr>
+          <w:p>
+            <w:r/>
+            <w:r>
+              <w:t>2, 4</w:t>
+            </w:r>
+          </w:p>
+        </w:tc>
+        <w:tc>
+          <w:tcPr>
+            <w:tcW w:type="dxa" w:w="2160"/>
+          </w:tcPr>
+          <w:p>
+            <w:r/>
+            <w:r>
+              <w:t>Module 3 is the one built specifically to prove TE's in-cluster vantage point gives them a definitive "not our problem" or "here's the path" answer — fastest way to earn their buy-in. Scenarios 5–7 are where they see that proof in action three different ways.</w:t>
+            </w:r>
+          </w:p>
+        </w:tc>
+      </w:tr>
+      <w:tr>
+        <w:tc>
+          <w:tcPr>
+            <w:tcW w:type="dxa" w:w="2160"/>
+          </w:tcPr>
+          <w:p>
+            <w:r/>
+            <w:r>
+              <w:rPr>
+                <w:b/>
+              </w:rPr>
+              <w:t>AI/ML Engineering</w:t>
+            </w:r>
+            <w:r>
+              <w:t xml:space="preserve"> (agent developers)</w:t>
+            </w:r>
+          </w:p>
+        </w:tc>
+        <w:tc>
+          <w:tcPr>
+            <w:tcW w:type="dxa" w:w="2160"/>
+          </w:tcPr>
+          <w:p>
+            <w:r/>
+            <w:r>
+              <w:t>2, 7</w:t>
+            </w:r>
+          </w:p>
+        </w:tc>
+        <w:tc>
+          <w:tcPr>
+            <w:tcW w:type="dxa" w:w="2160"/>
+          </w:tcPr>
+          <w:p>
+            <w:r/>
+            <w:r>
+              <w:t>3, 4</w:t>
+            </w:r>
+          </w:p>
+        </w:tc>
+        <w:tc>
+          <w:tcPr>
+            <w:tcW w:type="dxa" w:w="2160"/>
+          </w:tcPr>
+          <w:p>
+            <w:r/>
+            <w:r>
+              <w:t>Module 2 is the instrumentation pattern they'd actually copy into their own agent code. Module 7 (LLM auth failure) is the single most common failure mode they personally debug — the rest is infrastructure they don't own.</w:t>
+            </w:r>
+          </w:p>
+        </w:tc>
+      </w:tr>
+      <w:tr>
+        <w:tc>
+          <w:tcPr>
+            <w:tcW w:type="dxa" w:w="2160"/>
+          </w:tcPr>
+          <w:p>
+            <w:r/>
+            <w:r>
+              <w:rPr>
+                <w:b/>
+              </w:rPr>
+              <w:t>DevOps / Kubernetes Platform Team</w:t>
+            </w:r>
+          </w:p>
+        </w:tc>
+        <w:tc>
+          <w:tcPr>
+            <w:tcW w:type="dxa" w:w="2160"/>
+          </w:tcPr>
+          <w:p>
+            <w:r/>
+            <w:r>
+              <w:t>1, 4</w:t>
+            </w:r>
+          </w:p>
+        </w:tc>
+        <w:tc>
+          <w:tcPr>
+            <w:tcW w:type="dxa" w:w="2160"/>
+          </w:tcPr>
+          <w:p>
+            <w:r/>
+            <w:r>
+              <w:t>5, 6, 7 (can observe passively)</w:t>
+            </w:r>
+          </w:p>
+        </w:tc>
+        <w:tc>
+          <w:tcPr>
+            <w:tcW w:type="dxa" w:w="2160"/>
+          </w:tcPr>
+          <w:p>
+            <w:r/>
+            <w:r>
+              <w:t>They care about deployment footprint (one collector, no secondary agents) and how alerts plug into existing on-call tooling — not necessarily running each failure scenario themselves.</w:t>
+            </w:r>
+          </w:p>
+        </w:tc>
+      </w:tr>
+      <w:tr>
+        <w:tc>
+          <w:tcPr>
+            <w:tcW w:type="dxa" w:w="2160"/>
+          </w:tcPr>
+          <w:p>
+            <w:r/>
+            <w:r>
+              <w:rPr>
+                <w:b/>
+              </w:rPr>
+              <w:t>Incident Commander / On-Call Manager</w:t>
+            </w:r>
+          </w:p>
+        </w:tc>
+        <w:tc>
+          <w:tcPr>
+            <w:tcW w:type="dxa" w:w="2160"/>
+          </w:tcPr>
+          <w:p>
+            <w:r/>
+            <w:r>
+              <w:t>4, 5, 6, 7</w:t>
+            </w:r>
+          </w:p>
+        </w:tc>
+        <w:tc>
+          <w:tcPr>
+            <w:tcW w:type="dxa" w:w="2160"/>
+          </w:tcPr>
+          <w:p>
+            <w:r/>
+            <w:r>
+              <w:t>1, 2, 3</w:t>
+            </w:r>
+          </w:p>
+        </w:tc>
+        <w:tc>
+          <w:tcPr>
+            <w:tcW w:type="dxa" w:w="2160"/>
+          </w:tcPr>
+          <w:p>
+            <w:r/>
+            <w:r>
+              <w:t>They want to see what an actual page looks like — alert bodies with embedded triage decision trees — and experience the "who do I call" decision in each scenario.</w:t>
+            </w:r>
+          </w:p>
+        </w:tc>
+      </w:tr>
+      <w:tr>
+        <w:tc>
+          <w:tcPr>
+            <w:tcW w:type="dxa" w:w="2160"/>
+          </w:tcPr>
+          <w:p>
+            <w:r/>
+            <w:r>
+              <w:rPr>
+                <w:b/>
+              </w:rPr>
+              <w:t>Security / Compliance / Audit</w:t>
+            </w:r>
+          </w:p>
+        </w:tc>
+        <w:tc>
+          <w:tcPr>
+            <w:tcW w:type="dxa" w:w="2160"/>
+          </w:tcPr>
+          <w:p>
+            <w:r/>
+            <w:r>
+              <w:t>2</w:t>
+            </w:r>
+          </w:p>
+        </w:tc>
+        <w:tc>
+          <w:tcPr>
+            <w:tcW w:type="dxa" w:w="2160"/>
+          </w:tcPr>
+          <w:p>
+            <w:r/>
+            <w:r>
+              <w:t>3, 4, 5, 6, 7</w:t>
+            </w:r>
+          </w:p>
+        </w:tc>
+        <w:tc>
+          <w:tcPr>
+            <w:tcW w:type="dxa" w:w="2160"/>
+          </w:tcPr>
+          <w:p>
+            <w:r/>
+            <w:r>
+              <w:t xml:space="preserve">Module 2 shows what's captured (structured logs, </w:t>
+            </w:r>
+            <w:r>
+              <w:rPr>
+                <w:rFonts w:ascii="Consolas" w:hAnsi="Consolas"/>
+                <w:sz w:val="20"/>
+              </w:rPr>
+              <w:t>trace_id</w:t>
+            </w:r>
+            <w:r>
+              <w:t xml:space="preserve"> tagging, full exception stack traces) — the evidence story. Note: the standalone log-search/RCA walkthrough isn't part of this run (see Module 8 note) — flag if your compliance team needs to see that live in a follow-up session.</w:t>
+            </w:r>
+          </w:p>
+        </w:tc>
+      </w:tr>
+    </w:tbl>
+    <w:p/>
+    <w:p>
+      <w:pPr>
+        <w:pStyle w:val="Heading2"/>
+      </w:pPr>
+      <w:r>
+        <w:t>Suggested Attendance Patterns</w:t>
+      </w:r>
+    </w:p>
+    <w:p>
+      <w:r>
+        <w:rPr>
+          <w:b/>
+        </w:rPr>
+        <w:t>Option A — Everyone together (recommended for a first session):</w:t>
+      </w:r>
+      <w:r>
+        <w:t xml:space="preserve"> Run Modules 0–4 as a full group so everyone shares the same baseline understanding of the system and pipeline, then let Network/NetOps, AI/ML Engineering, and SRE self-select into the scenarios most relevant to them for Modules 5–7, and regroup for Module 8.</w:t>
+      </w:r>
+    </w:p>
+    <w:p>
+      <w:r>
+        <w:rPr>
+          <w:b/>
+        </w:rPr>
+        <w:t>Option B — Role-based breakout after Module 1:</w:t>
+      </w:r>
+      <w:r>
+        <w:t xml:space="preserve"> If calendars are tight, only require Module 1 (setup) for everyone, then route people by role using the matrix above, and regroup for Module 8's wrap-up so next steps are decided as a group, not in silos.</w:t>
+      </w:r>
+    </w:p>
+    <w:p>
+      <w:r>
+        <w:rPr>
+          <w:b/>
+        </w:rPr>
+        <w:t>Option C — Leadership-only abbreviated path:</w:t>
+      </w:r>
+      <w:r>
+        <w:t xml:space="preserve"> For an executive sponsor who won't run hands-on labs themselves, Modules 0 (Agenda) → 7 (LLM failure — highest business impact) → 8 (Wrap-Up) gives the business case in under 40 minutes without requiring them to touch a terminal.</w:t>
+      </w:r>
+    </w:p>
+    <w:p>
+      <w:pPr>
+        <w:pStyle w:val="Heading2"/>
+      </w:pPr>
+      <w:r>
+        <w:t>A note for the workshop sponsor</w:t>
+      </w:r>
+    </w:p>
+    <w:p>
+      <w:r>
+        <w:t xml:space="preserve">The one constant across every role: </w:t>
+      </w:r>
+      <w:r>
+        <w:rPr>
+          <w:b/>
+        </w:rPr>
+        <w:t>make sure whoever owns the Splunk Platform (Splunk Cloud) admin relationship in your organization is looped in before scaling this beyond the workshop.</w:t>
+      </w:r>
+      <w:r>
+        <w:t xml:space="preserve"> Log Observer Connect and full log-search RCA (mentioned in Module 8) require that access, and it's the one piece this workshop's shared environment can't demonstrate end-to-end.</w:t>
       </w:r>
     </w:p>
     <w:p>
@@ -4424,354 +4934,7 @@
         <w:pStyle w:val="Heading1"/>
       </w:pPr>
       <w:r>
-        <w:t>Module 8: Log Correlation &amp; RCA (15 min)</w:t>
-      </w:r>
-    </w:p>
-    <w:p>
-      <w:pPr>
-        <w:pStyle w:val="Heading2"/>
-      </w:pPr>
-      <w:r>
-        <w:t>Why this matters</w:t>
-      </w:r>
-    </w:p>
-    <w:p>
-      <w:r>
-        <w:rPr>
-          <w:b/>
-        </w:rPr>
-        <w:t>The audit trail story.</w:t>
-      </w:r>
-      <w:r>
-        <w:t xml:space="preserve"> Compliance and post-incident review need evidence of what the AI system did, when, and why — not just "it failed." This module shows the exact exception, tied to the exact trace, with zero manual correlation.</w:t>
-      </w:r>
-    </w:p>
-    <w:p>
-      <w:pPr>
-        <w:pStyle w:val="Heading2"/>
-      </w:pPr>
-      <w:r>
-        <w:t>Step 1: Re-trigger a failure to have something to correlate</w:t>
-      </w:r>
-    </w:p>
-    <w:p>
-      <w:pPr>
-        <w:shd w:val="clear" w:color="auto" w:fill="EDEDED"/>
-        <w:spacing w:before="80" w:after="160"/>
-        <w:ind w:left="216"/>
-      </w:pPr>
-      <w:r>
-        <w:rPr>
-          <w:rFonts w:ascii="Consolas" w:hAnsi="Consolas"/>
-          <w:sz w:val="19"/>
-        </w:rPr>
-        <w:t>bash scripts/09-demo-llm-unreachable.sh</w:t>
-      </w:r>
-    </w:p>
-    <w:p>
-      <w:r>
-        <w:t>(Same as Module 7 — if you already have a recent failure, you can skip this.)</w:t>
-      </w:r>
-    </w:p>
-    <w:p>
-      <w:pPr>
-        <w:pStyle w:val="Heading2"/>
-      </w:pPr>
-      <w:r>
-        <w:t>Step 2: Watch the exception in real time</w:t>
-      </w:r>
-    </w:p>
-    <w:p>
-      <w:pPr>
-        <w:shd w:val="clear" w:color="auto" w:fill="EDEDED"/>
-        <w:spacing w:before="80" w:after="160"/>
-        <w:ind w:left="216"/>
-      </w:pPr>
-      <w:r>
-        <w:rPr>
-          <w:rFonts w:ascii="Consolas" w:hAnsi="Consolas"/>
-          <w:sz w:val="19"/>
-        </w:rPr>
-        <w:t>kubectl logs -n travel-planner deployment/flight-agent -f</w:t>
-      </w:r>
-    </w:p>
-    <w:p>
-      <w:r>
-        <w:t>You should see a full Python stack trace (</w:t>
-      </w:r>
-      <w:r>
-        <w:rPr>
-          <w:rFonts w:ascii="Consolas" w:hAnsi="Consolas"/>
-          <w:sz w:val="20"/>
-        </w:rPr>
-        <w:t>openai.AuthenticationError</w:t>
-      </w:r>
-      <w:r>
-        <w:t xml:space="preserve"> or similar) — not just a one-line error message. This is because the code uses </w:t>
-      </w:r>
-      <w:r>
-        <w:rPr>
-          <w:rFonts w:ascii="Consolas" w:hAnsi="Consolas"/>
-          <w:sz w:val="20"/>
-        </w:rPr>
-        <w:t>logger.exception()</w:t>
-      </w:r>
-      <w:r>
-        <w:t xml:space="preserve">, not </w:t>
-      </w:r>
-      <w:r>
-        <w:rPr>
-          <w:rFonts w:ascii="Consolas" w:hAnsi="Consolas"/>
-          <w:sz w:val="20"/>
-        </w:rPr>
-        <w:t>logger.error()</w:t>
-      </w:r>
-      <w:r>
-        <w:t>, on every failure path (see Module 2).</w:t>
-      </w:r>
-    </w:p>
-    <w:p>
-      <w:pPr>
-        <w:pStyle w:val="Heading2"/>
-      </w:pPr>
-      <w:r>
-        <w:t>Step 3: Search Splunk Platform directly</w:t>
-      </w:r>
-    </w:p>
-    <w:p>
-      <w:r>
-        <w:t xml:space="preserve">Go to your Splunk Platform search UI (URL provided by your organizer, typically </w:t>
-      </w:r>
-      <w:r>
-        <w:rPr>
-          <w:rFonts w:ascii="Consolas" w:hAnsi="Consolas"/>
-          <w:sz w:val="20"/>
-        </w:rPr>
-        <w:t>https://&lt;your-org&gt;.splunkcloud.com</w:t>
-      </w:r>
-      <w:r>
-        <w:t>).</w:t>
-      </w:r>
-    </w:p>
-    <w:p>
-      <w:pPr>
-        <w:shd w:val="clear" w:color="auto" w:fill="EDEDED"/>
-        <w:spacing w:before="80" w:after="160"/>
-        <w:ind w:left="216"/>
-      </w:pPr>
-      <w:r>
-        <w:rPr>
-          <w:rFonts w:ascii="Consolas" w:hAnsi="Consolas"/>
-          <w:sz w:val="19"/>
-        </w:rPr>
-        <w:t>index=splunk4rookies-workshop log_level=ERROR earliest=-5m</w:t>
-        <w:br/>
-      </w:r>
-      <w:r>
-        <w:rPr>
-          <w:rFonts w:ascii="Consolas" w:hAnsi="Consolas"/>
-          <w:sz w:val="19"/>
-        </w:rPr>
-        <w:t>| table _time service.name body trace_id</w:t>
-      </w:r>
-    </w:p>
-    <w:p>
-      <w:r>
-        <w:rPr>
-          <w:b/>
-        </w:rPr>
-        <w:t>What to notice:</w:t>
-      </w:r>
-      <w:r>
-        <w:t xml:space="preserve"> every error event has a </w:t>
-      </w:r>
-      <w:r>
-        <w:rPr>
-          <w:rFonts w:ascii="Consolas" w:hAnsi="Consolas"/>
-          <w:sz w:val="20"/>
-        </w:rPr>
-        <w:t>trace_id</w:t>
-      </w:r>
-      <w:r>
-        <w:t>. Pick one.</w:t>
-      </w:r>
-    </w:p>
-    <w:p>
-      <w:pPr>
-        <w:pStyle w:val="Heading2"/>
-      </w:pPr>
-      <w:r>
-        <w:t>Step 4: Correlate to the trace</w:t>
-      </w:r>
-    </w:p>
-    <w:p>
-      <w:r>
-        <w:t xml:space="preserve">Copy a </w:t>
-      </w:r>
-      <w:r>
-        <w:rPr>
-          <w:rFonts w:ascii="Consolas" w:hAnsi="Consolas"/>
-          <w:sz w:val="20"/>
-        </w:rPr>
-        <w:t>trace_id</w:t>
-      </w:r>
-      <w:r>
-        <w:t xml:space="preserve"> value from Step 3. Go to Splunk APM → Trace Search → paste the </w:t>
-      </w:r>
-      <w:r>
-        <w:rPr>
-          <w:rFonts w:ascii="Consolas" w:hAnsi="Consolas"/>
-          <w:sz w:val="20"/>
-        </w:rPr>
-        <w:t>trace_id</w:t>
-      </w:r>
-      <w:r>
-        <w:t>. You should land directly on the exact trace that produced that log line.</w:t>
-      </w:r>
-    </w:p>
-    <w:p>
-      <w:r>
-        <w:rPr>
-          <w:b/>
-        </w:rPr>
-        <w:t>This is the RCA record</w:t>
-      </w:r>
-      <w:r>
-        <w:t>: exact exception → exact service → exact timestamp → correlated to the full distributed trace, with no manual log-grepping across services.</w:t>
-      </w:r>
-    </w:p>
-    <w:p>
-      <w:pPr>
-        <w:pStyle w:val="Heading2"/>
-      </w:pPr>
-      <w:r>
-        <w:t>Step 5: (Optional) Related Content button</w:t>
-      </w:r>
-    </w:p>
-    <w:p>
-      <w:r>
-        <w:t xml:space="preserve">If your workshop environment has Log Observer Connect configured (ask your organizer), clicking a span in APM shows a </w:t>
-      </w:r>
-      <w:r>
-        <w:rPr>
-          <w:b/>
-        </w:rPr>
-        <w:t>Related Content → Logs</w:t>
-      </w:r>
-      <w:r>
-        <w:t xml:space="preserve"> button that jumps straight to the correlated log — skipping the manual </w:t>
-      </w:r>
-      <w:r>
-        <w:rPr>
-          <w:rFonts w:ascii="Consolas" w:hAnsi="Consolas"/>
-          <w:sz w:val="20"/>
-        </w:rPr>
-        <w:t>trace_id</w:t>
-      </w:r>
-      <w:r>
-        <w:t xml:space="preserve"> copy/paste in Steps 3–4.</w:t>
-      </w:r>
-    </w:p>
-    <w:p>
-      <w:pPr>
-        <w:pStyle w:val="IntenseQuote"/>
-      </w:pPr>
-      <w:r>
-        <w:rPr>
-          <w:b/>
-        </w:rPr>
-        <w:t>Caveat:</w:t>
-      </w:r>
-      <w:r>
-        <w:t xml:space="preserve"> Log Observer Connect requires a Splunk Platform service account with admin-level setup. On a shared workshop Splunk Cloud instance, participants typically don't have this access — it must be configured by whoever provisioned the environment. </w:t>
-      </w:r>
-      <w:r>
-        <w:rPr>
-          <w:b/>
-        </w:rPr>
-        <w:t>This does not block the RCA workflow</w:t>
-      </w:r>
-      <w:r>
-        <w:t xml:space="preserve"> — the manual </w:t>
-      </w:r>
-      <w:r>
-        <w:rPr>
-          <w:rFonts w:ascii="Consolas" w:hAnsi="Consolas"/>
-          <w:sz w:val="20"/>
-        </w:rPr>
-        <w:t>trace_id</w:t>
-      </w:r>
-      <w:r>
-        <w:t xml:space="preserve"> correlation in Steps 3–4 works with zero additional setup and is available to you right now.</w:t>
-      </w:r>
-    </w:p>
-    <w:p>
-      <w:pPr>
-        <w:pStyle w:val="Heading2"/>
-      </w:pPr>
-      <w:r>
-        <w:t>Discussion Point</w:t>
-      </w:r>
-    </w:p>
-    <w:p>
-      <w:r>
-        <w:t xml:space="preserve">For a compliance team asking "prove what the AI system did during this incident," is </w:t>
-      </w:r>
-      <w:r>
-        <w:rPr>
-          <w:rFonts w:ascii="Consolas" w:hAnsi="Consolas"/>
-          <w:sz w:val="20"/>
-        </w:rPr>
-        <w:t>logger.exception()</w:t>
-      </w:r>
-      <w:r>
-        <w:t xml:space="preserve"> + </w:t>
-      </w:r>
-      <w:r>
-        <w:rPr>
-          <w:rFonts w:ascii="Consolas" w:hAnsi="Consolas"/>
-          <w:sz w:val="20"/>
-        </w:rPr>
-        <w:t>trace_id</w:t>
-      </w:r>
-      <w:r>
-        <w:t xml:space="preserve"> correlation enough evidence today? What additional fields (user ID, request payload, model version) would you need captured for your actual audit requirements?</w:t>
-      </w:r>
-    </w:p>
-    <w:p>
-      <w:pPr>
-        <w:pStyle w:val="Heading2"/>
-      </w:pPr>
-      <w:r>
-        <w:t>Troubleshooting</w:t>
-      </w:r>
-    </w:p>
-    <w:p>
-      <w:r>
-        <w:t xml:space="preserve">See repo root README → </w:t>
-      </w:r>
-      <w:r>
-        <w:rPr>
-          <w:i/>
-          <w:color w:val="2E5B8A"/>
-        </w:rPr>
-        <w:t>Log-Trace Correlation</w:t>
-      </w:r>
-      <w:r>
-        <w:t>.</w:t>
-      </w:r>
-    </w:p>
-    <w:p>
-      <w:r>
-        <w:br w:type="page"/>
-      </w:r>
-    </w:p>
-    <w:p>
-      <w:pPr>
-        <w:pStyle w:val="Heading1"/>
-      </w:pPr>
-      <w:r>
-        <w:t>Module 9: Wrap-Up &amp; Next Steps (10 min)</w:t>
+        <w:t>Module 8: Wrap-Up &amp; Next Steps (10 min)</w:t>
       </w:r>
     </w:p>
     <w:p>
@@ -4926,32 +5089,52 @@
           </w:p>
         </w:tc>
       </w:tr>
-      <w:tr>
-        <w:tc>
-          <w:tcPr>
-            <w:tcW w:type="dxa" w:w="4320"/>
-          </w:tcPr>
-          <w:p>
-            <w:r/>
-            <w:r>
-              <w:t>8</w:t>
-            </w:r>
-          </w:p>
-        </w:tc>
-        <w:tc>
-          <w:tcPr>
-            <w:tcW w:type="dxa" w:w="4320"/>
-          </w:tcPr>
-          <w:p>
-            <w:r/>
-            <w:r>
-              <w:t>Post-incident RCA — exact exception, correlated to trace, with no admin access required</w:t>
-            </w:r>
-          </w:p>
-        </w:tc>
-      </w:tr>
     </w:tbl>
     <w:p/>
+    <w:p>
+      <w:pPr>
+        <w:pStyle w:val="IntenseQuote"/>
+      </w:pPr>
+      <w:r>
+        <w:rPr>
+          <w:b/>
+        </w:rPr>
+        <w:t>Note on log-trace correlation:</w:t>
+      </w:r>
+      <w:r>
+        <w:t xml:space="preserve"> the underlying pattern (structured logs auto-tagged with </w:t>
+      </w:r>
+      <w:r>
+        <w:rPr>
+          <w:rFonts w:ascii="Consolas" w:hAnsi="Consolas"/>
+          <w:sz w:val="20"/>
+        </w:rPr>
+        <w:t>trace_id</w:t>
+      </w:r>
+      <w:r>
+        <w:t>/</w:t>
+      </w:r>
+      <w:r>
+        <w:rPr>
+          <w:rFonts w:ascii="Consolas" w:hAnsi="Consolas"/>
+          <w:sz w:val="20"/>
+        </w:rPr>
+        <w:t>span_id</w:t>
+      </w:r>
+      <w:r>
+        <w:t xml:space="preserve">, full exception stack traces via </w:t>
+      </w:r>
+      <w:r>
+        <w:rPr>
+          <w:rFonts w:ascii="Consolas" w:hAnsi="Consolas"/>
+          <w:sz w:val="20"/>
+        </w:rPr>
+        <w:t>logger.exception()</w:t>
+      </w:r>
+      <w:r>
+        <w:t>) is already live in every service you deployed today — you saw it in Module 2. This workshop's shared environment doesn't include a Splunk Platform (Splunk Cloud) instance for participants to search logs in directly, so that exercise isn't part of today's run. Ask your organizer if a working example is available to see it end-to-end.</w:t>
+      </w:r>
+    </w:p>
     <w:p>
       <w:pPr>
         <w:pStyle w:val="Heading2"/>
@@ -5003,7 +5186,7 @@
         <w:pStyle w:val="ListBullet"/>
       </w:pPr>
       <w:r>
-        <w:t xml:space="preserve">If you had the </w:t>
+        <w:t xml:space="preserve">If every log line from your AI agents were automatically tagged with a </w:t>
       </w:r>
       <w:r>
         <w:rPr>
@@ -5013,7 +5196,7 @@
         <w:t>trace_id</w:t>
       </w:r>
       <w:r>
-        <w:t>-to-log correlation from Module 8 today, would it satisfy your compliance team's audit requirement for AI system behavior?</w:t>
+        <w:t xml:space="preserve"> today, would that satisfy your compliance team's audit requirement for AI system behavior?</w:t>
       </w:r>
     </w:p>
     <w:p>
@@ -5080,10 +5263,10 @@
         <w:rPr>
           <w:b/>
         </w:rPr>
-        <w:t>Log Observer Connect enablement</w:t>
-      </w:r>
-      <w:r>
-        <w:t xml:space="preserve"> — if Module 8's manual correlation was useful but you want the one-click Related Content button, this requires a short admin session with whoever owns your Splunk Platform instance.</w:t>
+        <w:t>Log correlation walkthrough</w:t>
+      </w:r>
+      <w:r>
+        <w:t xml:space="preserve"> — schedule a follow-up session against a Splunk Platform instance you control to see trace-to-log correlation and Log Observer Connect end-to-end.</w:t>
       </w:r>
     </w:p>
     <w:p>

</xml_diff>

<commit_message>
fix: auto-detect API-scoped API_TOKEN for Splunk detector creation
deploy.sh and 05-create-splunk-detectors.sh previously only checked
SPLUNK_API_TOKEN, falling back to the ingest-only ACCESS_TOKEN, which
returns 401 when creating detectors. Workshop EC2 instances also
provision an API-scoped API_TOKEN in /etc/environment that was never
wired up. Both scripts now fall back to API_TOKEN before ACCESS_TOKEN.
Updated Module 1 and Module 4 workshop docs and regenerated the
combined workshop guide docx to match.
</commit_message>
<xml_diff>
--- a/workshop/AI_Agent_Observability_Workshop_Guide.docx
+++ b/workshop/AI_Agent_Observability_Workshop_Guide.docx
@@ -2379,17 +2379,17 @@
         <w:pStyle w:val="ListNumber"/>
       </w:pPr>
       <w:r>
-        <w:t xml:space="preserve">Splunk detectors (skipped if </w:t>
+        <w:t xml:space="preserve">Splunk detectors (auto-detects the API-scoped </w:t>
       </w:r>
       <w:r>
         <w:rPr>
           <w:rFonts w:ascii="Consolas" w:hAnsi="Consolas"/>
           <w:sz w:val="20"/>
         </w:rPr>
-        <w:t>SPLUNK_API_TOKEN</w:t>
-      </w:r>
-      <w:r>
-        <w:t xml:space="preserve"> isn't set — see Module 4)</w:t>
+        <w:t>API_TOKEN</w:t>
+      </w:r>
+      <w:r>
+        <w:t xml:space="preserve"> pre-set on workshop EC2 instances — see Module 4)</w:t>
       </w:r>
     </w:p>
     <w:p>
@@ -3810,7 +3810,66 @@
     </w:p>
     <w:p>
       <w:r>
-        <w:t>Requires an API-scoped Splunk access token (different from the ingest token used for data — ask your organizer if you don't have one).</w:t>
+        <w:t xml:space="preserve">Requires an API-scoped Splunk access token (different from the ingest token used for data). Workshop EC2 instances have this pre-set as </w:t>
+      </w:r>
+      <w:r>
+        <w:rPr>
+          <w:rFonts w:ascii="Consolas" w:hAnsi="Consolas"/>
+          <w:sz w:val="20"/>
+        </w:rPr>
+        <w:t>API_TOKEN</w:t>
+      </w:r>
+      <w:r>
+        <w:t xml:space="preserve"> in </w:t>
+      </w:r>
+      <w:r>
+        <w:rPr>
+          <w:rFonts w:ascii="Consolas" w:hAnsi="Consolas"/>
+          <w:sz w:val="20"/>
+        </w:rPr>
+        <w:t>/etc/environment</w:t>
+      </w:r>
+      <w:r>
+        <w:t xml:space="preserve"> — </w:t>
+      </w:r>
+      <w:r>
+        <w:rPr>
+          <w:rFonts w:ascii="Consolas" w:hAnsi="Consolas"/>
+          <w:sz w:val="20"/>
+        </w:rPr>
+        <w:t>deploy.sh</w:t>
+      </w:r>
+      <w:r>
+        <w:t xml:space="preserve"> and the script below pick it up automatically, no extra setup needed.</w:t>
+      </w:r>
+    </w:p>
+    <w:p>
+      <w:pPr>
+        <w:shd w:val="clear" w:color="auto" w:fill="EDEDED"/>
+        <w:spacing w:before="80" w:after="160"/>
+        <w:ind w:left="216"/>
+      </w:pPr>
+      <w:r>
+        <w:rPr>
+          <w:rFonts w:ascii="Consolas" w:hAnsi="Consolas"/>
+          <w:sz w:val="19"/>
+        </w:rPr>
+        <w:t>bash scripts/05-create-splunk-detectors.sh</w:t>
+      </w:r>
+    </w:p>
+    <w:p>
+      <w:r>
+        <w:t xml:space="preserve">If you're running outside a workshop EC2 instance and don't have </w:t>
+      </w:r>
+      <w:r>
+        <w:rPr>
+          <w:rFonts w:ascii="Consolas" w:hAnsi="Consolas"/>
+          <w:sz w:val="20"/>
+        </w:rPr>
+        <w:t>API_TOKEN</w:t>
+      </w:r>
+      <w:r>
+        <w:t xml:space="preserve"> pre-set, pass your own API-scoped token instead:</w:t>
       </w:r>
     </w:p>
     <w:p>
@@ -3825,6 +3884,47 @@
           <w:sz w:val="19"/>
         </w:rPr>
         <w:t>SPLUNK_API_TOKEN=&lt;your-api-scoped-token&gt; bash scripts/05-create-splunk-detectors.sh</w:t>
+      </w:r>
+    </w:p>
+    <w:p>
+      <w:r>
+        <w:rPr>
+          <w:b/>
+        </w:rPr>
+        <w:t>If you see `ERROR 401: Authentication is required`:</w:t>
+      </w:r>
+      <w:r>
+        <w:t xml:space="preserve"> the script fell back to an ingest-only token. Confirm </w:t>
+      </w:r>
+      <w:r>
+        <w:rPr>
+          <w:rFonts w:ascii="Consolas" w:hAnsi="Consolas"/>
+          <w:sz w:val="20"/>
+        </w:rPr>
+        <w:t>API_TOKEN</w:t>
+      </w:r>
+      <w:r>
+        <w:t xml:space="preserve"> is set (</w:t>
+      </w:r>
+      <w:r>
+        <w:rPr>
+          <w:rFonts w:ascii="Consolas" w:hAnsi="Consolas"/>
+          <w:sz w:val="20"/>
+        </w:rPr>
+        <w:t>echo $API_TOKEN</w:t>
+      </w:r>
+      <w:r>
+        <w:t xml:space="preserve">) or pass </w:t>
+      </w:r>
+      <w:r>
+        <w:rPr>
+          <w:rFonts w:ascii="Consolas" w:hAnsi="Consolas"/>
+          <w:sz w:val="20"/>
+        </w:rPr>
+        <w:t>SPLUNK_API_TOKEN</w:t>
+      </w:r>
+      <w:r>
+        <w:t xml:space="preserve"> explicitly.</w:t>
       </w:r>
     </w:p>
     <w:p>
@@ -4029,7 +4129,27 @@
         <w:t>Scripts</w:t>
       </w:r>
       <w:r>
-        <w:t xml:space="preserve"> for detector script reference. If detector creation fails, confirm your token has API scope, not just ingest scope.</w:t>
+        <w:t xml:space="preserve"> for detector script reference. If detector creation fails with a 401, confirm </w:t>
+      </w:r>
+      <w:r>
+        <w:rPr>
+          <w:rFonts w:ascii="Consolas" w:hAnsi="Consolas"/>
+          <w:sz w:val="20"/>
+        </w:rPr>
+        <w:t>API_TOKEN</w:t>
+      </w:r>
+      <w:r>
+        <w:t xml:space="preserve"> (or </w:t>
+      </w:r>
+      <w:r>
+        <w:rPr>
+          <w:rFonts w:ascii="Consolas" w:hAnsi="Consolas"/>
+          <w:sz w:val="20"/>
+        </w:rPr>
+        <w:t>SPLUNK_API_TOKEN</w:t>
+      </w:r>
+      <w:r>
+        <w:t>) is set and API-scoped, not just ingest scope.</w:t>
       </w:r>
     </w:p>
     <w:p>

</xml_diff>

<commit_message>
docs: document ALERT_EMAIL setup and add email-check steps to scenarios
Module 1 now covers setting ALERT_EMAIL before deploy.sh. Modules 5-7
each add a step reminding participants to check their inbox when the
corresponding detector alert fires. Regenerated the combined workshop
guide docx to match.
</commit_message>
<xml_diff>
--- a/workshop/AI_Agent_Observability_Workshop_Guide.docx
+++ b/workshop/AI_Agent_Observability_Workshop_Guide.docx
@@ -4,14 +4,10 @@
   <w:body>
     <w:p>
       <w:pPr>
+        <w:pStyle w:val="Title"/>
         <w:jc w:val="center"/>
       </w:pPr>
       <w:r>
-        <w:rPr>
-          <w:b/>
-          <w:color w:val="1F3A5F"/>
-          <w:sz w:val="60"/>
-        </w:rPr>
         <w:t>AI Agent Observability Workshop</w:t>
       </w:r>
     </w:p>
@@ -21,24 +17,10 @@
       </w:pPr>
       <w:r>
         <w:rPr>
-          <w:color w:val="444444"/>
-          <w:sz w:val="32"/>
+          <w:color w:val="555555"/>
+          <w:sz w:val="28"/>
         </w:rPr>
         <w:t>ThousandEyes + Splunk Observability Cloud</w:t>
-        <w:br/>
-        <w:t>Self-Guided Hands-On Workshop</w:t>
-      </w:r>
-    </w:p>
-    <w:p/>
-    <w:p>
-      <w:pPr>
-        <w:jc w:val="center"/>
-      </w:pPr>
-      <w:r>
-        <w:rPr>
-          <w:i/>
-        </w:rPr>
-        <w:t>This guide combines every workshop module into a single document so you can read and follow along from start to finish. Run the commands yourself as you go.</w:t>
       </w:r>
     </w:p>
     <w:p>
@@ -51,7 +33,7 @@
         <w:pStyle w:val="Heading1"/>
       </w:pPr>
       <w:r>
-        <w:t>Contents</w:t>
+        <w:t>Table of Contents</w:t>
       </w:r>
     </w:p>
     <w:p>
@@ -59,7 +41,7 @@
         <w:fldChar w:fldCharType="begin"/>
         <w:instrText xml:space="preserve">TOC \o "1-3" \h \z \u</w:instrText>
         <w:fldChar w:fldCharType="separate"/>
-        <w:t>Right-click here and choose "Update Field" to generate the table of contents.</w:t>
+        <w:t>Right-click and choose 'Update Field' to build the table of contents.</w:t>
         <w:fldChar w:fldCharType="end"/>
       </w:r>
     </w:p>
@@ -74,6 +56,14 @@
       </w:pPr>
       <w:r>
         <w:t>Before You Start</w:t>
+      </w:r>
+    </w:p>
+    <w:p>
+      <w:pPr>
+        <w:pStyle w:val="Heading1"/>
+      </w:pPr>
+      <w:r>
+        <w:t>Self-Guided Workshop — AI Agent Observability with ThousandEyes + Splunk</w:t>
       </w:r>
     </w:p>
     <w:p>
@@ -94,9 +84,8 @@
       <w:r>
         <w:rPr>
           <w:i/>
-          <w:color w:val="2E5B8A"/>
         </w:rPr>
-        <w:t>AGENDA.md</w:t>
+        <w:t>`AGENDA.md` (./AGENDA.md)</w:t>
       </w:r>
       <w:r>
         <w:t xml:space="preserve"> — full module breakdown with time estimates and what each module proves.</w:t>
@@ -115,9 +104,8 @@
       <w:r>
         <w:rPr>
           <w:i/>
-          <w:color w:val="2E5B8A"/>
         </w:rPr>
-        <w:t>ROLES.md</w:t>
+        <w:t>`ROLES.md` (./ROLES.md)</w:t>
       </w:r>
       <w:r>
         <w:t xml:space="preserve"> — which roles should attend which modules, and suggested attendance patterns if you can't get everyone in the room for the full session.</w:t>
@@ -158,9 +146,8 @@
     </w:p>
     <w:p>
       <w:pPr>
-        <w:shd w:val="clear" w:color="auto" w:fill="EDEDED"/>
-        <w:spacing w:before="80" w:after="160"/>
-        <w:ind w:left="216"/>
+        <w:spacing w:after="0"/>
+        <w:shd w:val="clear" w:fill="EDEDED"/>
       </w:pPr>
       <w:r>
         <w:rPr>
@@ -169,39 +156,16 @@
         </w:rPr>
         <w:t>orchestrator  POST /plan</w:t>
         <w:br/>
-      </w:r>
-      <w:r>
-        <w:rPr>
-          <w:rFonts w:ascii="Consolas" w:hAnsi="Consolas"/>
-          <w:sz w:val="19"/>
-        </w:rPr>
         <w:t xml:space="preserve">  ├── flight-agent    — flight search specialist</w:t>
         <w:br/>
-      </w:r>
-      <w:r>
-        <w:rPr>
-          <w:rFonts w:ascii="Consolas" w:hAnsi="Consolas"/>
-          <w:sz w:val="19"/>
-        </w:rPr>
         <w:t xml:space="preserve">  ├── hotel-agent     — hotel recommendation specialist</w:t>
         <w:br/>
-      </w:r>
-      <w:r>
-        <w:rPr>
-          <w:rFonts w:ascii="Consolas" w:hAnsi="Consolas"/>
-          <w:sz w:val="19"/>
-        </w:rPr>
         <w:t xml:space="preserve">  ├── activity-agent  — activities curation specialist</w:t>
         <w:br/>
-      </w:r>
-      <w:r>
-        <w:rPr>
-          <w:rFonts w:ascii="Consolas" w:hAnsi="Consolas"/>
-          <w:sz w:val="19"/>
-        </w:rPr>
         <w:t xml:space="preserve">  └── synthesizer     — combines results into itinerary</w:t>
       </w:r>
     </w:p>
+    <w:p/>
     <w:p>
       <w:pPr>
         <w:pStyle w:val="Heading2"/>
@@ -390,9 +354,8 @@
             <w:r>
               <w:rPr>
                 <w:i/>
-                <w:color w:val="2E5B8A"/>
               </w:rPr>
-              <w:t>01-environment-setup.md</w:t>
+              <w:t>`01-environment-setup.md` (./01-environment-setup.md)</w:t>
             </w:r>
           </w:p>
         </w:tc>
@@ -418,9 +381,8 @@
             <w:r>
               <w:rPr>
                 <w:i/>
-                <w:color w:val="2E5B8A"/>
               </w:rPr>
-              <w:t>02-instrumentation-deep-dive.md</w:t>
+              <w:t>`02-instrumentation-deep-dive.md` (./02-instrumentation-deep-dive.md)</w:t>
             </w:r>
           </w:p>
         </w:tc>
@@ -446,9 +408,8 @@
             <w:r>
               <w:rPr>
                 <w:i/>
-                <w:color w:val="2E5B8A"/>
               </w:rPr>
-              <w:t>03-thousandeyes-configuration.md</w:t>
+              <w:t>`03-thousandeyes-configuration.md` (./03-thousandeyes-configuration.md)</w:t>
             </w:r>
           </w:p>
         </w:tc>
@@ -474,9 +435,8 @@
             <w:r>
               <w:rPr>
                 <w:i/>
-                <w:color w:val="2E5B8A"/>
               </w:rPr>
-              <w:t>04-splunk-detectors-and-alerts.md</w:t>
+              <w:t>`04-splunk-detectors-and-alerts.md` (./04-splunk-detectors-and-alerts.md)</w:t>
             </w:r>
           </w:p>
         </w:tc>
@@ -502,9 +462,8 @@
             <w:r>
               <w:rPr>
                 <w:i/>
-                <w:color w:val="2E5B8A"/>
               </w:rPr>
-              <w:t>05-scenario-entry-point-down.md</w:t>
+              <w:t>`05-scenario-entry-point-down.md` (./05-scenario-entry-point-down.md)</w:t>
             </w:r>
           </w:p>
         </w:tc>
@@ -530,9 +489,8 @@
             <w:r>
               <w:rPr>
                 <w:i/>
-                <w:color w:val="2E5B8A"/>
               </w:rPr>
-              <w:t>06-scenario-agent-path-broken.md</w:t>
+              <w:t>`06-scenario-agent-path-broken.md` (./06-scenario-agent-path-broken.md)</w:t>
             </w:r>
           </w:p>
         </w:tc>
@@ -558,9 +516,8 @@
             <w:r>
               <w:rPr>
                 <w:i/>
-                <w:color w:val="2E5B8A"/>
               </w:rPr>
-              <w:t>07-scenario-llm-failure.md</w:t>
+              <w:t>`07-scenario-llm-failure.md` (./07-scenario-llm-failure.md)</w:t>
             </w:r>
           </w:p>
         </w:tc>
@@ -586,9 +543,8 @@
             <w:r>
               <w:rPr>
                 <w:i/>
-                <w:color w:val="2E5B8A"/>
               </w:rPr>
-              <w:t>08-wrap-up.md</w:t>
+              <w:t>`08-wrap-up.md` (./08-wrap-up.md)</w:t>
             </w:r>
           </w:p>
         </w:tc>
@@ -619,9 +575,8 @@
       <w:r>
         <w:rPr>
           <w:i/>
-          <w:color w:val="2E5B8A"/>
         </w:rPr>
-        <w:t>README.md</w:t>
+        <w:t>`README.md` (../README.md#troubleshooting)</w:t>
       </w:r>
       <w:r>
         <w:t>, which has the deeper reference material (token formats, common pod failures, etc).</w:t>
@@ -682,9 +637,8 @@
       <w:r>
         <w:rPr>
           <w:i/>
-          <w:color w:val="2E5B8A"/>
         </w:rPr>
-        <w:t>08-wrap-up.md</w:t>
+        <w:t>`08-wrap-up.md` (./08-wrap-up.md)</w:t>
       </w:r>
       <w:r>
         <w:t>.</w:t>
@@ -875,9 +829,8 @@
             <w:r>
               <w:rPr>
                 <w:i/>
-                <w:color w:val="2E5B8A"/>
               </w:rPr>
-              <w:t>Welcome &amp; Objectives</w:t>
+              <w:t>Welcome &amp; Objectives (#module-0--welcome--objectives-5-min)</w:t>
             </w:r>
           </w:p>
         </w:tc>
@@ -936,9 +889,8 @@
             <w:r>
               <w:rPr>
                 <w:i/>
-                <w:color w:val="2E5B8A"/>
               </w:rPr>
-              <w:t>Environment &amp; Architecture</w:t>
+              <w:t>Environment &amp; Architecture (./01-environment-setup.md)</w:t>
             </w:r>
           </w:p>
         </w:tc>
@@ -997,9 +949,8 @@
             <w:r>
               <w:rPr>
                 <w:i/>
-                <w:color w:val="2E5B8A"/>
               </w:rPr>
-              <w:t>OTel Instrumentation Deep-Dive</w:t>
+              <w:t>OTel Instrumentation Deep-Dive (./02-instrumentation-deep-dive.md)</w:t>
             </w:r>
           </w:p>
         </w:tc>
@@ -1058,9 +1009,8 @@
             <w:r>
               <w:rPr>
                 <w:i/>
-                <w:color w:val="2E5B8A"/>
               </w:rPr>
-              <w:t>ThousandEyes Configuration</w:t>
+              <w:t>ThousandEyes Configuration (./03-thousandeyes-configuration.md)</w:t>
             </w:r>
           </w:p>
         </w:tc>
@@ -1119,9 +1069,8 @@
             <w:r>
               <w:rPr>
                 <w:i/>
-                <w:color w:val="2E5B8A"/>
               </w:rPr>
-              <w:t>Splunk Detectors &amp; Alerting</w:t>
+              <w:t>Splunk Detectors &amp; Alerting (./04-splunk-detectors-and-alerts.md)</w:t>
             </w:r>
           </w:p>
         </w:tc>
@@ -1180,9 +1129,8 @@
             <w:r>
               <w:rPr>
                 <w:i/>
-                <w:color w:val="2E5B8A"/>
               </w:rPr>
-              <w:t>Scenario 1: Entry Point Down</w:t>
+              <w:t>Scenario 1: Entry Point Down (./05-scenario-entry-point-down.md)</w:t>
             </w:r>
           </w:p>
         </w:tc>
@@ -1241,9 +1189,8 @@
             <w:r>
               <w:rPr>
                 <w:i/>
-                <w:color w:val="2E5B8A"/>
               </w:rPr>
-              <w:t>Scenario 2: Agent Path Broken</w:t>
+              <w:t>Scenario 2: Agent Path Broken (./06-scenario-agent-path-broken.md)</w:t>
             </w:r>
           </w:p>
         </w:tc>
@@ -1302,9 +1249,8 @@
             <w:r>
               <w:rPr>
                 <w:i/>
-                <w:color w:val="2E5B8A"/>
               </w:rPr>
-              <w:t>Scenario 3: LLM Auth Failure</w:t>
+              <w:t>Scenario 3: LLM Auth Failure (./07-scenario-llm-failure.md)</w:t>
             </w:r>
           </w:p>
         </w:tc>
@@ -1363,9 +1309,8 @@
             <w:r>
               <w:rPr>
                 <w:i/>
-                <w:color w:val="2E5B8A"/>
               </w:rPr>
-              <w:t>Wrap-Up &amp; Next Steps</w:t>
+              <w:t>Wrap-Up &amp; Next Steps (./08-wrap-up.md)</w:t>
             </w:r>
           </w:p>
         </w:tc>
@@ -1407,25 +1352,33 @@
     <w:p/>
     <w:p>
       <w:pPr>
-        <w:pStyle w:val="IntenseQuote"/>
+        <w:ind w:left="432"/>
       </w:pPr>
       <w:r>
         <w:rPr>
           <w:b/>
+          <w:i/>
         </w:rPr>
         <w:t>Note:</w:t>
       </w:r>
       <w:r>
+        <w:rPr>
+          <w:i/>
+        </w:rPr>
         <w:t xml:space="preserve"> log-trace correlation (structured logs auto-tagged with </w:t>
       </w:r>
       <w:r>
         <w:rPr>
           <w:rFonts w:ascii="Consolas" w:hAnsi="Consolas"/>
+          <w:i/>
           <w:sz w:val="20"/>
         </w:rPr>
         <w:t>trace_id</w:t>
       </w:r>
       <w:r>
+        <w:rPr>
+          <w:i/>
+        </w:rPr>
         <w:t>, full exception stack traces) is instrumented and visible in Module 2, but a standalone Splunk Platform log-search exercise isn't included in this run — the shared workshop environment doesn't include a Splunk Cloud instance for participants. See the note in Module 8.</w:t>
       </w:r>
     </w:p>
@@ -1648,9 +1601,8 @@
       <w:r>
         <w:rPr>
           <w:i/>
-          <w:color w:val="2E5B8A"/>
         </w:rPr>
-        <w:t>README.md</w:t>
+        <w:t>`README.md` (./README.md)</w:t>
       </w:r>
       <w:r>
         <w:t xml:space="preserve"> for the full setup checklist before starting Module 1, and </w:t>
@@ -1658,9 +1610,8 @@
       <w:r>
         <w:rPr>
           <w:i/>
-          <w:color w:val="2E5B8A"/>
         </w:rPr>
-        <w:t>ROLES.md</w:t>
+        <w:t>`ROLES.md` (./ROLES.md)</w:t>
       </w:r>
       <w:r>
         <w:t xml:space="preserve"> for who on your team should attend which modules.</w:t>
@@ -2254,9 +2205,8 @@
     </w:p>
     <w:p>
       <w:pPr>
-        <w:shd w:val="clear" w:color="auto" w:fill="EDEDED"/>
-        <w:spacing w:before="80" w:after="160"/>
-        <w:ind w:left="216"/>
+        <w:spacing w:after="0"/>
+        <w:shd w:val="clear" w:fill="EDEDED"/>
       </w:pPr>
       <w:r>
         <w:rPr>
@@ -2265,29 +2215,45 @@
         </w:rPr>
         <w:t>export TE_BEARER_TOKEN="your-oauth-bearer-token"</w:t>
         <w:br/>
+        <w:t>export AGENT_HOSTNAME="your-name"     # becomes te-agent-your-name in TE dashboard</w:t>
+        <w:br/>
+        <w:t>export TEST_PREFIX="your-name"        # prefix for all TE test names</w:t>
+        <w:br/>
+        <w:t>export LLM_PROVIDER=mock              # no LLM key needed for this workshop</w:t>
+        <w:br/>
+        <w:t>export ALERT_EMAIL="you@example.com"  # optional: email yourself on detector alerts</w:t>
+      </w:r>
+    </w:p>
+    <w:p/>
+    <w:p>
+      <w:r>
+        <w:rPr>
+          <w:b/>
+        </w:rPr>
+        <w:t>Want alerts emailed to you?</w:t>
+      </w:r>
+      <w:r>
+        <w:t xml:space="preserve"> Set </w:t>
       </w:r>
       <w:r>
         <w:rPr>
           <w:rFonts w:ascii="Consolas" w:hAnsi="Consolas"/>
-          <w:sz w:val="19"/>
+          <w:sz w:val="20"/>
         </w:rPr>
-        <w:t>export AGENT_HOSTNAME="your-name"     # becomes te-agent-your-name in TE dashboard</w:t>
-        <w:br/>
+        <w:t>ALERT_EMAIL</w:t>
+      </w:r>
+      <w:r>
+        <w:t xml:space="preserve"> above before running </w:t>
       </w:r>
       <w:r>
         <w:rPr>
           <w:rFonts w:ascii="Consolas" w:hAnsi="Consolas"/>
-          <w:sz w:val="19"/>
+          <w:sz w:val="20"/>
         </w:rPr>
-        <w:t>export TEST_PREFIX="your-name"        # prefix for all TE test names</w:t>
-        <w:br/>
-      </w:r>
-      <w:r>
-        <w:rPr>
-          <w:rFonts w:ascii="Consolas" w:hAnsi="Consolas"/>
-          <w:sz w:val="19"/>
-        </w:rPr>
-        <w:t>export LLM_PROVIDER=mock              # no LLM key needed for this workshop</w:t>
+        <w:t>deploy.sh</w:t>
+      </w:r>
+      <w:r>
+        <w:t>. Every detector created in Step 2 will include an Email notification to that address — you'll get paged for real during the scenarios in Modules 5–7. Skip it and detectors are created with no notification recipients (see Module 4 to add them later).</w:t>
       </w:r>
     </w:p>
     <w:p>
@@ -2300,9 +2266,8 @@
     </w:p>
     <w:p>
       <w:pPr>
-        <w:shd w:val="clear" w:color="auto" w:fill="EDEDED"/>
-        <w:spacing w:before="80" w:after="160"/>
-        <w:ind w:left="216"/>
+        <w:spacing w:after="0"/>
+        <w:shd w:val="clear" w:fill="EDEDED"/>
       </w:pPr>
       <w:r>
         <w:rPr>
@@ -2311,23 +2276,12 @@
         </w:rPr>
         <w:t>cd te-o11y-integration</w:t>
         <w:br/>
-      </w:r>
-      <w:r>
-        <w:rPr>
-          <w:rFonts w:ascii="Consolas" w:hAnsi="Consolas"/>
-          <w:sz w:val="19"/>
-        </w:rPr>
         <w:t>chmod +x deploy.sh scripts/*.sh</w:t>
         <w:br/>
-      </w:r>
-      <w:r>
-        <w:rPr>
-          <w:rFonts w:ascii="Consolas" w:hAnsi="Consolas"/>
-          <w:sz w:val="19"/>
-        </w:rPr>
         <w:t>./deploy.sh</w:t>
       </w:r>
     </w:p>
+    <w:p/>
     <w:p>
       <w:r>
         <w:t>This runs five steps in order — watch the terminal output for each:</w:t>
@@ -2389,7 +2343,17 @@
         <w:t>API_TOKEN</w:t>
       </w:r>
       <w:r>
-        <w:t xml:space="preserve"> pre-set on workshop EC2 instances — see Module 4)</w:t>
+        <w:t xml:space="preserve"> pre-set on workshop EC2 instances, and emails </w:t>
+      </w:r>
+      <w:r>
+        <w:rPr>
+          <w:rFonts w:ascii="Consolas" w:hAnsi="Consolas"/>
+          <w:sz w:val="20"/>
+        </w:rPr>
+        <w:t>ALERT_EMAIL</w:t>
+      </w:r>
+      <w:r>
+        <w:t xml:space="preserve"> if you set it — see Module 4)</w:t>
       </w:r>
     </w:p>
     <w:p>
@@ -2399,9 +2363,8 @@
       <w:r>
         <w:rPr>
           <w:i/>
-          <w:color w:val="2E5B8A"/>
         </w:rPr>
-        <w:t>README.md</w:t>
+        <w:t>`README.md` (../README.md#architecture)</w:t>
       </w:r>
       <w:r>
         <w:t>.</w:t>
@@ -2417,9 +2380,8 @@
     </w:p>
     <w:p>
       <w:pPr>
-        <w:shd w:val="clear" w:color="auto" w:fill="EDEDED"/>
-        <w:spacing w:before="80" w:after="160"/>
-        <w:ind w:left="216"/>
+        <w:spacing w:after="0"/>
+        <w:shd w:val="clear" w:fill="EDEDED"/>
       </w:pPr>
       <w:r>
         <w:rPr>
@@ -2428,52 +2390,27 @@
         </w:rPr>
         <w:t>kubectl get deployments -n travel-planner</w:t>
         <w:br/>
-      </w:r>
-      <w:r>
-        <w:rPr>
-          <w:rFonts w:ascii="Consolas" w:hAnsi="Consolas"/>
-          <w:sz w:val="19"/>
-        </w:rPr>
         <w:t># All 5 should show 1/1 READY</w:t>
         <w:br/>
-      </w:r>
-      <w:r>
-        <w:rPr>
-          <w:rFonts w:ascii="Consolas" w:hAnsi="Consolas"/>
-          <w:sz w:val="19"/>
-        </w:rPr>
-        <w:t xml:space="preserve"> </w:t>
         <w:br/>
-      </w:r>
-      <w:r>
-        <w:rPr>
-          <w:rFonts w:ascii="Consolas" w:hAnsi="Consolas"/>
-          <w:sz w:val="19"/>
-        </w:rPr>
         <w:t>kubectl get pods -n te-demo</w:t>
         <w:br/>
-      </w:r>
-      <w:r>
-        <w:rPr>
-          <w:rFonts w:ascii="Consolas" w:hAnsi="Consolas"/>
-          <w:sz w:val="19"/>
-        </w:rPr>
         <w:t># thousandeyes agent should be Running</w:t>
+      </w:r>
+    </w:p>
+    <w:p/>
+    <w:p>
+      <w:pPr>
+        <w:pStyle w:val="Heading2"/>
+      </w:pPr>
+      <w:r>
+        <w:t>Step 4: Generate a baseline trace manually</w:t>
       </w:r>
     </w:p>
     <w:p>
       <w:pPr>
-        <w:pStyle w:val="Heading2"/>
-      </w:pPr>
-      <w:r>
-        <w:t>Step 4: Generate a baseline trace manually</w:t>
-      </w:r>
-    </w:p>
-    <w:p>
-      <w:pPr>
-        <w:shd w:val="clear" w:color="auto" w:fill="EDEDED"/>
-        <w:spacing w:before="80" w:after="160"/>
-        <w:ind w:left="216"/>
+        <w:spacing w:after="0"/>
+        <w:shd w:val="clear" w:fill="EDEDED"/>
       </w:pPr>
       <w:r>
         <w:rPr>
@@ -2482,31 +2419,14 @@
         </w:rPr>
         <w:t>kubectl run -it --rm test --image=curlimages/curl --restart=Never -n travel-planner -- \</w:t>
         <w:br/>
-      </w:r>
-      <w:r>
-        <w:rPr>
-          <w:rFonts w:ascii="Consolas" w:hAnsi="Consolas"/>
-          <w:sz w:val="19"/>
-        </w:rPr>
         <w:t xml:space="preserve">  curl -X POST http://orchestrator.travel-planner.svc.cluster.local:8080/plan \</w:t>
         <w:br/>
-      </w:r>
-      <w:r>
-        <w:rPr>
-          <w:rFonts w:ascii="Consolas" w:hAnsi="Consolas"/>
-          <w:sz w:val="19"/>
-        </w:rPr>
         <w:t xml:space="preserve">    -H 'Content-Type: application/json' \</w:t>
         <w:br/>
-      </w:r>
-      <w:r>
-        <w:rPr>
-          <w:rFonts w:ascii="Consolas" w:hAnsi="Consolas"/>
-          <w:sz w:val="19"/>
-        </w:rPr>
         <w:t xml:space="preserve">    -d '{"origin": "Seattle", "destination": "Paris", "travellers": 2}'</w:t>
       </w:r>
     </w:p>
+    <w:p/>
     <w:p>
       <w:r>
         <w:t>You should get back a JSON itinerary. This request is now a trace in Splunk APM.</w:t>
@@ -2594,9 +2514,8 @@
       <w:r>
         <w:rPr>
           <w:i/>
-          <w:color w:val="2E5B8A"/>
         </w:rPr>
-        <w:t>Troubleshooting</w:t>
+        <w:t>Troubleshooting (../README.md#troubleshooting)</w:t>
       </w:r>
       <w:r>
         <w:t>, especially "ThousandEyes agent never appears in dashboard" and "Travel planner pods in CrashLoopBackOff".</w:t>
@@ -2649,9 +2568,8 @@
     </w:p>
     <w:p>
       <w:pPr>
-        <w:shd w:val="clear" w:color="auto" w:fill="EDEDED"/>
-        <w:spacing w:before="80" w:after="160"/>
-        <w:ind w:left="216"/>
+        <w:spacing w:after="0"/>
+        <w:shd w:val="clear" w:fill="EDEDED"/>
       </w:pPr>
       <w:r>
         <w:rPr>
@@ -2661,6 +2579,7 @@
         <w:t>cat travel-planner/shared/otel_setup.py</w:t>
       </w:r>
     </w:p>
+    <w:p/>
     <w:p>
       <w:r>
         <w:t>Find and understand three things:</w:t>
@@ -2808,9 +2727,8 @@
     </w:p>
     <w:p>
       <w:pPr>
-        <w:shd w:val="clear" w:color="auto" w:fill="EDEDED"/>
-        <w:spacing w:before="80" w:after="160"/>
-        <w:ind w:left="216"/>
+        <w:spacing w:after="0"/>
+        <w:shd w:val="clear" w:fill="EDEDED"/>
       </w:pPr>
       <w:r>
         <w:rPr>
@@ -2820,6 +2738,7 @@
         <w:t>cat travel-planner/orchestrator/app.py</w:t>
       </w:r>
     </w:p>
+    <w:p/>
     <w:p>
       <w:r>
         <w:t>Trace the request lifecycle:</w:t>
@@ -2945,9 +2864,8 @@
     </w:p>
     <w:p>
       <w:pPr>
-        <w:shd w:val="clear" w:color="auto" w:fill="EDEDED"/>
-        <w:spacing w:before="80" w:after="160"/>
-        <w:ind w:left="216"/>
+        <w:spacing w:after="0"/>
+        <w:shd w:val="clear" w:fill="EDEDED"/>
       </w:pPr>
       <w:r>
         <w:rPr>
@@ -2957,6 +2875,7 @@
         <w:t>cat travel-planner/flight_agent/app.py</w:t>
       </w:r>
     </w:p>
+    <w:p/>
     <w:p>
       <w:r>
         <w:t xml:space="preserve">Same pattern, simpler: </w:t>
@@ -3012,9 +2931,8 @@
     </w:p>
     <w:p>
       <w:pPr>
-        <w:shd w:val="clear" w:color="auto" w:fill="EDEDED"/>
-        <w:spacing w:before="80" w:after="160"/>
-        <w:ind w:left="216"/>
+        <w:spacing w:after="0"/>
+        <w:shd w:val="clear" w:fill="EDEDED"/>
       </w:pPr>
       <w:r>
         <w:rPr>
@@ -3024,6 +2942,7 @@
         <w:t>kubectl logs -n travel-planner deployment/orchestrator -f</w:t>
       </w:r>
     </w:p>
+    <w:p/>
     <w:p>
       <w:r>
         <w:t xml:space="preserve">In another terminal, fire a request (same command as Module 1, Step 4). Watch the log lines stream — each one already has structure, even though this is just </w:t>
@@ -3049,9 +2968,8 @@
     </w:p>
     <w:p>
       <w:pPr>
-        <w:shd w:val="clear" w:color="auto" w:fill="EDEDED"/>
-        <w:spacing w:before="80" w:after="160"/>
-        <w:ind w:left="216"/>
+        <w:spacing w:after="0"/>
+        <w:shd w:val="clear" w:fill="EDEDED"/>
       </w:pPr>
       <w:r>
         <w:rPr>
@@ -3061,6 +2979,7 @@
         <w:t>kubectl logs -l app=splunk-otel-collector -f --container otel-collector</w:t>
       </w:r>
     </w:p>
+    <w:p/>
     <w:p>
       <w:r>
         <w:t>Fire another request. You should see log records flowing through the collector's logs pipeline (</w:t>
@@ -3134,9 +3053,8 @@
       <w:r>
         <w:rPr>
           <w:i/>
-          <w:color w:val="2E5B8A"/>
         </w:rPr>
-        <w:t>Log-Trace Correlation</w:t>
+        <w:t>Log-Trace Correlation (../README.md#log-trace-correlation)</w:t>
       </w:r>
       <w:r>
         <w:t xml:space="preserve"> and </w:t>
@@ -3144,9 +3062,8 @@
       <w:r>
         <w:rPr>
           <w:i/>
-          <w:color w:val="2E5B8A"/>
         </w:rPr>
-        <w:t>Bi-directional Drilldowns Setup</w:t>
+        <w:t>Bi-directional Drilldowns Setup (../README.md#bi-directional-drilldowns-setup)</w:t>
       </w:r>
       <w:r>
         <w:t>.</w:t>
@@ -3197,9 +3114,8 @@
     </w:p>
     <w:p>
       <w:pPr>
-        <w:shd w:val="clear" w:color="auto" w:fill="EDEDED"/>
-        <w:spacing w:before="80" w:after="160"/>
-        <w:ind w:left="216"/>
+        <w:spacing w:after="0"/>
+        <w:shd w:val="clear" w:fill="EDEDED"/>
       </w:pPr>
       <w:r>
         <w:rPr>
@@ -3209,6 +3125,7 @@
         <w:t>kubectl get pods -n te-demo -o wide</w:t>
       </w:r>
     </w:p>
+    <w:p/>
     <w:p>
       <w:r>
         <w:rPr>
@@ -3240,9 +3157,8 @@
     </w:p>
     <w:p>
       <w:pPr>
-        <w:shd w:val="clear" w:color="auto" w:fill="EDEDED"/>
-        <w:spacing w:before="80" w:after="160"/>
-        <w:ind w:left="216"/>
+        <w:spacing w:after="0"/>
+        <w:shd w:val="clear" w:fill="EDEDED"/>
       </w:pPr>
       <w:r>
         <w:rPr>
@@ -3252,6 +3168,7 @@
         <w:t>cat scripts/04-create-te-tests.sh</w:t>
       </w:r>
     </w:p>
+    <w:p/>
     <w:p>
       <w:r>
         <w:t>Find the two things that make TE tests correlate with APM:</w:t>
@@ -3595,9 +3512,8 @@
     </w:p>
     <w:p>
       <w:pPr>
-        <w:shd w:val="clear" w:color="auto" w:fill="EDEDED"/>
-        <w:spacing w:before="80" w:after="160"/>
-        <w:ind w:left="216"/>
+        <w:spacing w:after="0"/>
+        <w:shd w:val="clear" w:fill="EDEDED"/>
       </w:pPr>
       <w:r>
         <w:rPr>
@@ -3606,23 +3522,12 @@
         </w:rPr>
         <w:t>curl -s https://api.thousandeyes.com/v7/tests/http-server/&lt;TEST_ID&gt; \</w:t>
         <w:br/>
-      </w:r>
-      <w:r>
-        <w:rPr>
-          <w:rFonts w:ascii="Consolas" w:hAnsi="Consolas"/>
-          <w:sz w:val="19"/>
-        </w:rPr>
         <w:t xml:space="preserve">  -H "Authorization: Bearer ${TE_BEARER_TOKEN}" \</w:t>
         <w:br/>
-      </w:r>
-      <w:r>
-        <w:rPr>
-          <w:rFonts w:ascii="Consolas" w:hAnsi="Consolas"/>
-          <w:sz w:val="19"/>
-        </w:rPr>
         <w:t xml:space="preserve">  | python3 -c "import json,sys; t=json.load(sys.stdin); print('distributedTracing:', t.get('distributedTracing')); print('customHeaders:', t.get('customHeaders'))"</w:t>
       </w:r>
     </w:p>
+    <w:p/>
     <w:p>
       <w:r>
         <w:t xml:space="preserve">(Get a </w:t>
@@ -3729,9 +3634,8 @@
       <w:r>
         <w:rPr>
           <w:i/>
-          <w:color w:val="2E5B8A"/>
         </w:rPr>
-        <w:t>te.*` span attributes missing on `/health` spans</w:t>
+        <w:t>`te.*` span attributes missing on `/health` spans (../README.md#te-span-attributes-missing-on-health-spans)</w:t>
       </w:r>
       <w:r>
         <w:t xml:space="preserve"> and </w:t>
@@ -3739,9 +3643,8 @@
       <w:r>
         <w:rPr>
           <w:i/>
-          <w:color w:val="2E5B8A"/>
         </w:rPr>
-        <w:t>ThousandEyes agent never appears in dashboard</w:t>
+        <w:t>ThousandEyes agent never appears in dashboard (../README.md#thousandeyes-agent-never-appears-in-dashboard)</w:t>
       </w:r>
       <w:r>
         <w:t>.</w:t>
@@ -3783,9 +3686,8 @@
     </w:p>
     <w:p>
       <w:pPr>
-        <w:shd w:val="clear" w:color="auto" w:fill="EDEDED"/>
-        <w:spacing w:before="80" w:after="160"/>
-        <w:ind w:left="216"/>
+        <w:spacing w:after="0"/>
+        <w:shd w:val="clear" w:fill="EDEDED"/>
       </w:pPr>
       <w:r>
         <w:rPr>
@@ -3795,6 +3697,7 @@
         <w:t>cat scripts/05-create-splunk-detectors.sh</w:t>
       </w:r>
     </w:p>
+    <w:p/>
     <w:p>
       <w:r>
         <w:t>Notice each detector's alert body isn't generic — it links to the specific TE test relevant to that failure mode, and (for the LLM scenario) includes an embedded triage decision tree.</w:t>
@@ -3845,9 +3748,8 @@
     </w:p>
     <w:p>
       <w:pPr>
-        <w:shd w:val="clear" w:color="auto" w:fill="EDEDED"/>
-        <w:spacing w:before="80" w:after="160"/>
-        <w:ind w:left="216"/>
+        <w:spacing w:after="0"/>
+        <w:shd w:val="clear" w:fill="EDEDED"/>
       </w:pPr>
       <w:r>
         <w:rPr>
@@ -3857,6 +3759,7 @@
         <w:t>bash scripts/05-create-splunk-detectors.sh</w:t>
       </w:r>
     </w:p>
+    <w:p/>
     <w:p>
       <w:r>
         <w:t xml:space="preserve">If you're running outside a workshop EC2 instance and don't have </w:t>
@@ -3874,9 +3777,8 @@
     </w:p>
     <w:p>
       <w:pPr>
-        <w:shd w:val="clear" w:color="auto" w:fill="EDEDED"/>
-        <w:spacing w:before="80" w:after="160"/>
-        <w:ind w:left="216"/>
+        <w:spacing w:after="0"/>
+        <w:shd w:val="clear" w:fill="EDEDED"/>
       </w:pPr>
       <w:r>
         <w:rPr>
@@ -3886,6 +3788,7 @@
         <w:t>SPLUNK_API_TOKEN=&lt;your-api-scoped-token&gt; bash scripts/05-create-splunk-detectors.sh</w:t>
       </w:r>
     </w:p>
+    <w:p/>
     <w:p>
       <w:r>
         <w:rPr>
@@ -3925,6 +3828,66 @@
       </w:r>
       <w:r>
         <w:t xml:space="preserve"> explicitly.</w:t>
+      </w:r>
+    </w:p>
+    <w:p>
+      <w:r>
+        <w:rPr>
+          <w:b/>
+        </w:rPr>
+        <w:t>Want alerts emailed to you?</w:t>
+      </w:r>
+      <w:r>
+        <w:t xml:space="preserve"> Set </w:t>
+      </w:r>
+      <w:r>
+        <w:rPr>
+          <w:rFonts w:ascii="Consolas" w:hAnsi="Consolas"/>
+          <w:sz w:val="20"/>
+        </w:rPr>
+        <w:t>ALERT_EMAIL</w:t>
+      </w:r>
+      <w:r>
+        <w:t xml:space="preserve"> before running </w:t>
+      </w:r>
+      <w:r>
+        <w:rPr>
+          <w:rFonts w:ascii="Consolas" w:hAnsi="Consolas"/>
+          <w:sz w:val="20"/>
+        </w:rPr>
+        <w:t>deploy.sh</w:t>
+      </w:r>
+      <w:r>
+        <w:t xml:space="preserve"> (or the script directly) and every detector rule is created with an Email notification recipient automatically:</w:t>
+      </w:r>
+    </w:p>
+    <w:p>
+      <w:pPr>
+        <w:spacing w:after="0"/>
+        <w:shd w:val="clear" w:fill="EDEDED"/>
+      </w:pPr>
+      <w:r>
+        <w:rPr>
+          <w:rFonts w:ascii="Consolas" w:hAnsi="Consolas"/>
+          <w:sz w:val="19"/>
+        </w:rPr>
+        <w:t>ALERT_EMAIL=you@example.com bash scripts/05-create-splunk-detectors.sh</w:t>
+      </w:r>
+    </w:p>
+    <w:p/>
+    <w:p>
+      <w:r>
+        <w:t xml:space="preserve">Without </w:t>
+      </w:r>
+      <w:r>
+        <w:rPr>
+          <w:rFonts w:ascii="Consolas" w:hAnsi="Consolas"/>
+          <w:sz w:val="20"/>
+        </w:rPr>
+        <w:t>ALERT_EMAIL</w:t>
+      </w:r>
+      <w:r>
+        <w:t>, detectors are created with no notification recipients — add them later in Splunk under Alerts → Detectors → [detector] → Edit → Notifications.</w:t>
       </w:r>
     </w:p>
     <w:p>
@@ -4124,9 +4087,8 @@
       <w:r>
         <w:rPr>
           <w:i/>
-          <w:color w:val="2E5B8A"/>
         </w:rPr>
-        <w:t>Scripts</w:t>
+        <w:t>Scripts (../README.md#scripts)</w:t>
       </w:r>
       <w:r>
         <w:t xml:space="preserve"> for detector script reference. If detector creation fails with a 401, confirm </w:t>
@@ -4194,9 +4156,8 @@
     </w:p>
     <w:p>
       <w:pPr>
-        <w:shd w:val="clear" w:color="auto" w:fill="EDEDED"/>
-        <w:spacing w:before="80" w:after="160"/>
-        <w:ind w:left="216"/>
+        <w:spacing w:after="0"/>
+        <w:shd w:val="clear" w:fill="EDEDED"/>
       </w:pPr>
       <w:r>
         <w:rPr>
@@ -4206,6 +4167,7 @@
         <w:t>bash scripts/07-demo-orchestrator-down.sh</w:t>
       </w:r>
     </w:p>
+    <w:p/>
     <w:p>
       <w:r>
         <w:t xml:space="preserve">This scales </w:t>
@@ -4336,6 +4298,21 @@
       </w:r>
     </w:p>
     <w:p>
+      <w:r>
+        <w:t xml:space="preserve">If you set </w:t>
+      </w:r>
+      <w:r>
+        <w:rPr>
+          <w:rFonts w:ascii="Consolas" w:hAnsi="Consolas"/>
+          <w:sz w:val="20"/>
+        </w:rPr>
+        <w:t>ALERT_EMAIL</w:t>
+      </w:r>
+      <w:r>
+        <w:t xml:space="preserve"> in Module 1, check your inbox — you should have an email for this alert too, with the same triage body.</w:t>
+      </w:r>
+    </w:p>
+    <w:p>
       <w:pPr>
         <w:pStyle w:val="Heading2"/>
       </w:pPr>
@@ -4364,9 +4341,8 @@
     </w:p>
     <w:p>
       <w:pPr>
-        <w:shd w:val="clear" w:color="auto" w:fill="EDEDED"/>
-        <w:spacing w:before="80" w:after="160"/>
-        <w:ind w:left="216"/>
+        <w:spacing w:after="0"/>
+        <w:shd w:val="clear" w:fill="EDEDED"/>
       </w:pPr>
       <w:r>
         <w:rPr>
@@ -4376,6 +4352,7 @@
         <w:t>bash scripts/10-demo-restore.sh</w:t>
       </w:r>
     </w:p>
+    <w:p/>
     <w:p>
       <w:r>
         <w:t>Wait ~2 minutes for TE tests to return to green before moving to the next module.</w:t>
@@ -4409,9 +4386,8 @@
       <w:r>
         <w:rPr>
           <w:i/>
-          <w:color w:val="2E5B8A"/>
         </w:rPr>
-        <w:t>Demo Scenarios: Scenario 1</w:t>
+        <w:t>Demo Scenarios: Scenario 1 (../README.md#scenario-1-orchestrator-unreachable)</w:t>
       </w:r>
       <w:r>
         <w:t>.</w:t>
@@ -4459,9 +4435,8 @@
     </w:p>
     <w:p>
       <w:pPr>
-        <w:shd w:val="clear" w:color="auto" w:fill="EDEDED"/>
-        <w:spacing w:before="80" w:after="160"/>
-        <w:ind w:left="216"/>
+        <w:spacing w:after="0"/>
+        <w:shd w:val="clear" w:fill="EDEDED"/>
       </w:pPr>
       <w:r>
         <w:rPr>
@@ -4470,23 +4445,12 @@
         </w:rPr>
         <w:t>bash scripts/08-demo-agent-down.sh</w:t>
         <w:br/>
-      </w:r>
-      <w:r>
-        <w:rPr>
-          <w:rFonts w:ascii="Consolas" w:hAnsi="Consolas"/>
-          <w:sz w:val="19"/>
-        </w:rPr>
         <w:t># or target a specific agent:</w:t>
         <w:br/>
-      </w:r>
-      <w:r>
-        <w:rPr>
-          <w:rFonts w:ascii="Consolas" w:hAnsi="Consolas"/>
-          <w:sz w:val="19"/>
-        </w:rPr>
         <w:t>AGENT=hotel-agent bash scripts/08-demo-agent-down.sh</w:t>
       </w:r>
     </w:p>
+    <w:p/>
     <w:p>
       <w:r>
         <w:t>Scales the target specialist agent to 0 replicas.</w:t>
@@ -4658,31 +4622,45 @@
       </w:r>
     </w:p>
     <w:p>
-      <w:pPr>
-        <w:pStyle w:val="Heading2"/>
-      </w:pPr>
-      <w:r>
-        <w:t>The verdict</w:t>
+      <w:r>
+        <w:t xml:space="preserve">If you set </w:t>
+      </w:r>
+      <w:r>
+        <w:rPr>
+          <w:rFonts w:ascii="Consolas" w:hAnsi="Consolas"/>
+          <w:sz w:val="20"/>
+        </w:rPr>
+        <w:t>ALERT_EMAIL</w:t>
+      </w:r>
+      <w:r>
+        <w:t xml:space="preserve"> in Module 1, check your inbox for the corresponding email — it should name the specific agent that's down.</w:t>
       </w:r>
     </w:p>
     <w:p>
-      <w:r>
-        <w:t>One click from a failing span to network-layer evidence. No manual copy-paste of test IDs, no cross-tool context switching.</w:t>
+      <w:pPr>
+        <w:pStyle w:val="Heading2"/>
+      </w:pPr>
+      <w:r>
+        <w:t>The verdict</w:t>
       </w:r>
     </w:p>
     <w:p>
-      <w:pPr>
-        <w:pStyle w:val="Heading2"/>
-      </w:pPr>
-      <w:r>
-        <w:t>Step 6: Restore</w:t>
+      <w:r>
+        <w:t>One click from a failing span to network-layer evidence. No manual copy-paste of test IDs, no cross-tool context switching.</w:t>
       </w:r>
     </w:p>
     <w:p>
       <w:pPr>
-        <w:shd w:val="clear" w:color="auto" w:fill="EDEDED"/>
-        <w:spacing w:before="80" w:after="160"/>
-        <w:ind w:left="216"/>
+        <w:pStyle w:val="Heading2"/>
+      </w:pPr>
+      <w:r>
+        <w:t>Step 6: Restore</w:t>
+      </w:r>
+    </w:p>
+    <w:p>
+      <w:pPr>
+        <w:spacing w:after="0"/>
+        <w:shd w:val="clear" w:fill="EDEDED"/>
       </w:pPr>
       <w:r>
         <w:rPr>
@@ -4692,6 +4670,7 @@
         <w:t>bash scripts/10-demo-restore.sh</w:t>
       </w:r>
     </w:p>
+    <w:p/>
     <w:p>
       <w:pPr>
         <w:pStyle w:val="Heading2"/>
@@ -4720,9 +4699,8 @@
       <w:r>
         <w:rPr>
           <w:i/>
-          <w:color w:val="2E5B8A"/>
         </w:rPr>
-        <w:t>Demo Scenarios: Scenario 2</w:t>
+        <w:t>Demo Scenarios: Scenario 2 (../README.md#scenario-2-agent-to-agent-communication-failure)</w:t>
       </w:r>
       <w:r>
         <w:t xml:space="preserve"> and </w:t>
@@ -4730,9 +4708,8 @@
       <w:r>
         <w:rPr>
           <w:i/>
-          <w:color w:val="2E5B8A"/>
         </w:rPr>
-        <w:t>"View in ThousandEyes" button not appearing</w:t>
+        <w:t>"View in ThousandEyes" button not appearing (../README.md#view-in-thousandeyes-button-not-appearing)</w:t>
       </w:r>
       <w:r>
         <w:t>.</w:t>
@@ -4780,9 +4757,8 @@
     </w:p>
     <w:p>
       <w:pPr>
-        <w:shd w:val="clear" w:color="auto" w:fill="EDEDED"/>
-        <w:spacing w:before="80" w:after="160"/>
-        <w:ind w:left="216"/>
+        <w:spacing w:after="0"/>
+        <w:shd w:val="clear" w:fill="EDEDED"/>
       </w:pPr>
       <w:r>
         <w:rPr>
@@ -4792,6 +4768,7 @@
         <w:t>bash scripts/09-demo-llm-unreachable.sh</w:t>
       </w:r>
     </w:p>
+    <w:p/>
     <w:p>
       <w:r>
         <w:t>This reconfigures the agents with an invalid LLM API key and fires a test request. Takes ~60 seconds.</w:t>
@@ -4974,31 +4951,45 @@
       </w:r>
     </w:p>
     <w:p>
-      <w:pPr>
-        <w:pStyle w:val="Heading2"/>
-      </w:pPr>
-      <w:r>
-        <w:t>The verdict</w:t>
+      <w:r>
+        <w:t xml:space="preserve">If you set </w:t>
+      </w:r>
+      <w:r>
+        <w:rPr>
+          <w:rFonts w:ascii="Consolas" w:hAnsi="Consolas"/>
+          <w:sz w:val="20"/>
+        </w:rPr>
+        <w:t>ALERT_EMAIL</w:t>
+      </w:r>
+      <w:r>
+        <w:t xml:space="preserve"> in Module 1, check your inbox — the same decision tree should show up in the email body.</w:t>
       </w:r>
     </w:p>
     <w:p>
-      <w:r>
-        <w:t>TE separates "can we reach the LLM network" from "can our app authenticate with the LLM API." That separation is the difference between a 5-minute fix and a 2-hour war room where the network team gets paged for nothing.</w:t>
+      <w:pPr>
+        <w:pStyle w:val="Heading2"/>
+      </w:pPr>
+      <w:r>
+        <w:t>The verdict</w:t>
       </w:r>
     </w:p>
     <w:p>
-      <w:pPr>
-        <w:pStyle w:val="Heading2"/>
-      </w:pPr>
-      <w:r>
-        <w:t>Step 6: Restore</w:t>
+      <w:r>
+        <w:t>TE separates "can we reach the LLM network" from "can our app authenticate with the LLM API." That separation is the difference between a 5-minute fix and a 2-hour war room where the network team gets paged for nothing.</w:t>
       </w:r>
     </w:p>
     <w:p>
       <w:pPr>
-        <w:shd w:val="clear" w:color="auto" w:fill="EDEDED"/>
-        <w:spacing w:before="80" w:after="160"/>
-        <w:ind w:left="216"/>
+        <w:pStyle w:val="Heading2"/>
+      </w:pPr>
+      <w:r>
+        <w:t>Step 6: Restore</w:t>
+      </w:r>
+    </w:p>
+    <w:p>
+      <w:pPr>
+        <w:spacing w:after="0"/>
+        <w:shd w:val="clear" w:fill="EDEDED"/>
       </w:pPr>
       <w:r>
         <w:rPr>
@@ -5008,6 +4999,7 @@
         <w:t>bash scripts/10-demo-restore.sh</w:t>
       </w:r>
     </w:p>
+    <w:p/>
     <w:p>
       <w:pPr>
         <w:pStyle w:val="Heading2"/>
@@ -5036,9 +5028,8 @@
       <w:r>
         <w:rPr>
           <w:i/>
-          <w:color w:val="2E5B8A"/>
         </w:rPr>
-        <w:t>Demo Scenarios: Scenario 3</w:t>
+        <w:t>Demo Scenarios: Scenario 3 (../README.md#scenario-3-agent-to-llm-communication-failure)</w:t>
       </w:r>
       <w:r>
         <w:t>.</w:t>
@@ -5213,45 +5204,61 @@
     <w:p/>
     <w:p>
       <w:pPr>
-        <w:pStyle w:val="IntenseQuote"/>
+        <w:ind w:left="432"/>
       </w:pPr>
       <w:r>
         <w:rPr>
           <w:b/>
+          <w:i/>
         </w:rPr>
         <w:t>Note on log-trace correlation:</w:t>
       </w:r>
       <w:r>
+        <w:rPr>
+          <w:i/>
+        </w:rPr>
         <w:t xml:space="preserve"> the underlying pattern (structured logs auto-tagged with </w:t>
       </w:r>
       <w:r>
         <w:rPr>
           <w:rFonts w:ascii="Consolas" w:hAnsi="Consolas"/>
+          <w:i/>
           <w:sz w:val="20"/>
         </w:rPr>
         <w:t>trace_id</w:t>
       </w:r>
       <w:r>
+        <w:rPr>
+          <w:i/>
+        </w:rPr>
         <w:t>/</w:t>
       </w:r>
       <w:r>
         <w:rPr>
           <w:rFonts w:ascii="Consolas" w:hAnsi="Consolas"/>
+          <w:i/>
           <w:sz w:val="20"/>
         </w:rPr>
         <w:t>span_id</w:t>
       </w:r>
       <w:r>
+        <w:rPr>
+          <w:i/>
+        </w:rPr>
         <w:t xml:space="preserve">, full exception stack traces via </w:t>
       </w:r>
       <w:r>
         <w:rPr>
           <w:rFonts w:ascii="Consolas" w:hAnsi="Consolas"/>
+          <w:i/>
           <w:sz w:val="20"/>
         </w:rPr>
         <w:t>logger.exception()</w:t>
       </w:r>
       <w:r>
+        <w:rPr>
+          <w:i/>
+        </w:rPr>
         <w:t>) is already live in every service you deployed today — you saw it in Module 2. This workshop's shared environment doesn't include a Splunk Platform (Splunk Cloud) instance for participants to search logs in directly, so that exercise isn't part of today's run. Ask your organizer if a working example is available to see it end-to-end.</w:t>
       </w:r>
     </w:p>
@@ -5265,9 +5272,8 @@
     </w:p>
     <w:p>
       <w:pPr>
-        <w:shd w:val="clear" w:color="auto" w:fill="EDEDED"/>
-        <w:spacing w:before="80" w:after="160"/>
-        <w:ind w:left="216"/>
+        <w:spacing w:after="0"/>
+        <w:shd w:val="clear" w:fill="EDEDED"/>
       </w:pPr>
       <w:r>
         <w:rPr>
@@ -5277,6 +5283,7 @@
         <w:t>./teardown.sh</w:t>
       </w:r>
     </w:p>
+    <w:p/>
     <w:p>
       <w:pPr>
         <w:pStyle w:val="Heading2"/>
@@ -5847,8 +5854,8 @@
       <w:rFonts w:asciiTheme="majorHAnsi" w:eastAsiaTheme="majorEastAsia" w:hAnsiTheme="majorHAnsi" w:cstheme="majorBidi"/>
       <w:b/>
       <w:bCs/>
-      <w:color w:val="1F3A5F"/>
-      <w:sz w:val="44"/>
+      <w:color w:val="365F91" w:themeColor="accent1" w:themeShade="BF"/>
+      <w:sz w:val="28"/>
       <w:szCs w:val="28"/>
     </w:rPr>
   </w:style>
@@ -5871,8 +5878,8 @@
       <w:rFonts w:asciiTheme="majorHAnsi" w:eastAsiaTheme="majorEastAsia" w:hAnsiTheme="majorHAnsi" w:cstheme="majorBidi"/>
       <w:b/>
       <w:bCs/>
-      <w:color w:val="1F3A5F"/>
-      <w:sz w:val="32"/>
+      <w:color w:val="4F81BD" w:themeColor="accent1"/>
+      <w:sz w:val="26"/>
       <w:szCs w:val="26"/>
     </w:rPr>
   </w:style>
@@ -5895,8 +5902,7 @@
       <w:rFonts w:asciiTheme="majorHAnsi" w:eastAsiaTheme="majorEastAsia" w:hAnsiTheme="majorHAnsi" w:cstheme="majorBidi"/>
       <w:b/>
       <w:bCs/>
-      <w:color w:val="1F3A5F"/>
-      <w:sz w:val="26"/>
+      <w:color w:val="4F81BD" w:themeColor="accent1"/>
     </w:rPr>
   </w:style>
   <w:style w:type="paragraph" w:styleId="Heading4">
@@ -5921,8 +5927,7 @@
       <w:bCs/>
       <w:i/>
       <w:iCs/>
-      <w:color w:val="1F3A5F"/>
-      <w:sz w:val="22"/>
+      <w:color w:val="4F81BD" w:themeColor="accent1"/>
     </w:rPr>
   </w:style>
   <w:style w:type="paragraph" w:styleId="Heading5">

</xml_diff>

<commit_message>
Document TE_BEARER_TOKEN as pre-settable via /etc/environment
Attendees never need to type or see the shared ThousandEyes bearer
token if the organizer adds it to /etc/environment the same way as
ACCESS_TOKEN/REALM/INSTANCE. Scripts already just read from the
environment, so no code change was needed there — this updates
deploy.sh's usage comments/error message and Module 1 / workshop
README to reflect the pre-set path, with manual export as fallback.
</commit_message>
<xml_diff>
--- a/workshop/AI_Agent_Observability_Workshop_Guide.docx
+++ b/workshop/AI_Agent_Observability_Workshop_Guide.docx
@@ -1310,8 +1310,6 @@
           <w:rFonts w:ascii="Courier New" w:hAnsi="Courier New"/>
           <w:sz w:val="18"/>
         </w:rPr>
-        <w:t>export TE_BEARER_TOKEN="your-oauth-bearer-token"</w:t>
-        <w:br/>
         <w:t>export AGENT_HOSTNAME="your-name"     # becomes te-agent-your-name in TE dashboard</w:t>
         <w:br/>
         <w:t>export TEST_PREFIX="your-name"        # prefix for all TE test names</w:t>
@@ -1319,6 +1317,11 @@
         <w:t>export LLM_PROVIDER=mock              # no LLM key needed for this workshop</w:t>
         <w:br/>
         <w:t>export ALERT_EMAIL="you@example.com"  # optional: email yourself on detector alerts</w:t>
+      </w:r>
+    </w:p>
+    <w:p>
+      <w:r>
+        <w:t>TE_BEARER_TOKEN is pre-set in /etc/environment on workshop EC2 instances — same shared token for every attendee, same mechanism as ACCESS_TOKEN/REALM/INSTANCE. You never need to type or see the actual token value. (Not on a workshop instance? Export it yourself: export TE_BEARER_TOKEN="your-oauth-bearer-token" — see ThousandEyes Token Guide.)</w:t>
       </w:r>
     </w:p>
     <w:p>

</xml_diff>

<commit_message>
Revert "Document TE_BEARER_TOKEN as pre-settable via /etc/environment"
This reverts commit 7c4813b8ff5323638050c06556a0db3cc2b76c59.
</commit_message>
<xml_diff>
--- a/workshop/AI_Agent_Observability_Workshop_Guide.docx
+++ b/workshop/AI_Agent_Observability_Workshop_Guide.docx
@@ -1310,6 +1310,8 @@
           <w:rFonts w:ascii="Courier New" w:hAnsi="Courier New"/>
           <w:sz w:val="18"/>
         </w:rPr>
+        <w:t>export TE_BEARER_TOKEN="your-oauth-bearer-token"</w:t>
+        <w:br/>
         <w:t>export AGENT_HOSTNAME="your-name"     # becomes te-agent-your-name in TE dashboard</w:t>
         <w:br/>
         <w:t>export TEST_PREFIX="your-name"        # prefix for all TE test names</w:t>
@@ -1317,11 +1319,6 @@
         <w:t>export LLM_PROVIDER=mock              # no LLM key needed for this workshop</w:t>
         <w:br/>
         <w:t>export ALERT_EMAIL="you@example.com"  # optional: email yourself on detector alerts</w:t>
-      </w:r>
-    </w:p>
-    <w:p>
-      <w:r>
-        <w:t>TE_BEARER_TOKEN is pre-set in /etc/environment on workshop EC2 instances — same shared token for every attendee, same mechanism as ACCESS_TOKEN/REALM/INSTANCE. You never need to type or see the actual token value. (Not on a workshop instance? Export it yourself: export TE_BEARER_TOKEN="your-oauth-bearer-token" — see ThousandEyes Token Guide.)</w:t>
       </w:r>
     </w:p>
     <w:p>

</xml_diff>